<commit_message>
Wire Brief imports and fix Word paragraph, section and attribution fidelity
</commit_message>
<xml_diff>
--- a/public/templates/Rama_Living_Completed_Example.docx
+++ b/public/templates/Rama_Living_Completed_Example.docx
@@ -16,11 +16,9 @@
           <w:tag w:val="business.name"/>
         </w:sdtPr>
         <w:sdtContent>
-          <w:p>
-            <w:r>
-              <w:t>Rama Living</w:t>
-            </w:r>
-          </w:p>
+          <w:r>
+            <w:t>Rama Living</w:t>
+          </w:r>
         </w:sdtContent>
       </w:sdt>
     </w:p>
@@ -33,11 +31,9 @@
           <w:tag w:val="business.description"/>
         </w:sdtPr>
         <w:sdtContent>
-          <w:p>
-            <w:r>
-              <w:t>Furniture for everyday life.</w:t>
-            </w:r>
-          </w:p>
+          <w:r>
+            <w:t>Furniture for everyday life.</w:t>
+          </w:r>
         </w:sdtContent>
       </w:sdt>
     </w:p>
@@ -50,11 +46,9 @@
           <w:tag w:val="business.services"/>
         </w:sdtPr>
         <w:sdtContent>
-          <w:p>
-            <w:r>
-              <w:t>Living room, Office</w:t>
-            </w:r>
-          </w:p>
+          <w:r>
+            <w:t>Living room, Office</w:t>
+          </w:r>
         </w:sdtContent>
       </w:sdt>
     </w:p>
@@ -67,11 +61,9 @@
           <w:tag w:val="brand.colors"/>
         </w:sdtPr>
         <w:sdtContent>
-          <w:p>
-            <w:r>
-              <w:t>#F6F1E8, #2C2520, #244638</w:t>
-            </w:r>
-          </w:p>
+          <w:r>
+            <w:t>#F6F1E8, #2C2520, #244638</w:t>
+          </w:r>
         </w:sdtContent>
       </w:sdt>
     </w:p>
@@ -84,11 +76,9 @@
           <w:tag w:val="brand.font"/>
         </w:sdtPr>
         <w:sdtContent>
-          <w:p>
-            <w:r>
-              <w:t>serif</w:t>
-            </w:r>
-          </w:p>
+          <w:r>
+            <w:t>serif</w:t>
+          </w:r>
         </w:sdtContent>
       </w:sdt>
     </w:p>
@@ -101,11 +91,9 @@
           <w:tag w:val="site.home"/>
         </w:sdtPr>
         <w:sdtContent>
-          <w:p>
-            <w:r>
-              <w:t>home</w:t>
-            </w:r>
-          </w:p>
+          <w:r>
+            <w:t>home</w:t>
+          </w:r>
         </w:sdtContent>
       </w:sdt>
     </w:p>
@@ -118,14 +106,12 @@
           <w:tag w:val="site.pages"/>
         </w:sdtPr>
         <w:sdtContent>
-          <w:p>
-            <w:r>
-              <w:t>home | Home | index.html
+          <w:r>
+            <w:t>home | Home | index.html
 shop | Shop | shop.html
 lookbook | Lookbook | lookbook.html
 about | About &amp; Help | about.html</w:t>
-            </w:r>
-          </w:p>
+          </w:r>
         </w:sdtContent>
       </w:sdt>
     </w:p>
@@ -138,11 +124,9 @@
           <w:tag w:val="footer.text"/>
         </w:sdtPr>
         <w:sdtContent>
-          <w:p>
-            <w:r>
-              <w:t>Made for everyday living.</w:t>
-            </w:r>
-          </w:p>
+          <w:r>
+            <w:t>Made for everyday living.</w:t>
+          </w:r>
         </w:sdtContent>
       </w:sdt>
     </w:p>
@@ -155,11 +139,9 @@
           <w:tag w:val="site.notice"/>
         </w:sdtPr>
         <w:sdtContent>
-          <w:p>
-            <w:r>
-              <w:t>Fictional showroom. Prices are illustrative.</w:t>
-            </w:r>
-          </w:p>
+          <w:r>
+            <w:t>Fictional showroom. Prices are illustrative.</w:t>
+          </w:r>
         </w:sdtContent>
       </w:sdt>
     </w:p>
@@ -177,11 +159,9 @@
           <w:tag w:val="page.id"/>
         </w:sdtPr>
         <w:sdtContent>
-          <w:p>
-            <w:r>
-              <w:t>home</w:t>
-            </w:r>
-          </w:p>
+          <w:r>
+            <w:t>home</w:t>
+          </w:r>
         </w:sdtContent>
       </w:sdt>
     </w:p>
@@ -194,11 +174,9 @@
           <w:tag w:val="page.title"/>
         </w:sdtPr>
         <w:sdtContent>
-          <w:p>
-            <w:r>
-              <w:t>Rama Living | Furniture</w:t>
-            </w:r>
-          </w:p>
+          <w:r>
+            <w:t>Rama Living | Furniture</w:t>
+          </w:r>
         </w:sdtContent>
       </w:sdt>
     </w:p>
@@ -211,11 +189,9 @@
           <w:tag w:val="page.hero.id"/>
         </w:sdtPr>
         <w:sdtContent>
-          <w:p>
-            <w:r>
-              <w:t>home-hero</w:t>
-            </w:r>
-          </w:p>
+          <w:r>
+            <w:t>home-hero</w:t>
+          </w:r>
         </w:sdtContent>
       </w:sdt>
     </w:p>
@@ -228,11 +204,9 @@
           <w:tag w:val="page.hero.heading"/>
         </w:sdtPr>
         <w:sdtContent>
-          <w:p>
-            <w:r>
-              <w:t>Make room for everyday living.</w:t>
-            </w:r>
-          </w:p>
+          <w:r>
+            <w:t>Make room for everyday living.</w:t>
+          </w:r>
         </w:sdtContent>
       </w:sdt>
     </w:p>
@@ -245,11 +219,9 @@
           <w:tag w:val="page.hero.body"/>
         </w:sdtPr>
         <w:sdtContent>
-          <w:p>
-            <w:r>
-              <w:t>Considered furniture and useful spaces.</w:t>
-            </w:r>
-          </w:p>
+          <w:r>
+            <w:t>Considered furniture and useful spaces.</w:t>
+          </w:r>
         </w:sdtContent>
       </w:sdt>
     </w:p>
@@ -262,11 +234,9 @@
           <w:tag w:val="page.hero.button"/>
         </w:sdtPr>
         <w:sdtContent>
-          <w:p>
-            <w:r>
-              <w:t>Browse furniture | shop.html</w:t>
-            </w:r>
-          </w:p>
+          <w:r>
+            <w:t>Browse furniture | shop.html</w:t>
+          </w:r>
         </w:sdtContent>
       </w:sdt>
     </w:p>
@@ -284,11 +254,9 @@
           <w:tag w:val="page.id"/>
         </w:sdtPr>
         <w:sdtContent>
-          <w:p>
-            <w:r>
-              <w:t>shop</w:t>
-            </w:r>
-          </w:p>
+          <w:r>
+            <w:t>shop</w:t>
+          </w:r>
         </w:sdtContent>
       </w:sdt>
     </w:p>
@@ -301,11 +269,9 @@
           <w:tag w:val="page.title"/>
         </w:sdtPr>
         <w:sdtContent>
-          <w:p>
-            <w:r>
-              <w:t>shop</w:t>
-            </w:r>
-          </w:p>
+          <w:r>
+            <w:t>shop</w:t>
+          </w:r>
         </w:sdtContent>
       </w:sdt>
     </w:p>
@@ -318,11 +284,9 @@
           <w:tag w:val="page.hero.id"/>
         </w:sdtPr>
         <w:sdtContent>
-          <w:p>
-            <w:r>
-              <w:t>shop-hero</w:t>
-            </w:r>
-          </w:p>
+          <w:r>
+            <w:t>shop-hero</w:t>
+          </w:r>
         </w:sdtContent>
       </w:sdt>
     </w:p>
@@ -335,11 +299,9 @@
           <w:tag w:val="page.hero.heading"/>
         </w:sdtPr>
         <w:sdtContent>
-          <w:p>
-            <w:r>
-              <w:t>Choose your next favourite piece.</w:t>
-            </w:r>
-          </w:p>
+          <w:r>
+            <w:t>Choose your next favourite piece.</w:t>
+          </w:r>
         </w:sdtContent>
       </w:sdt>
     </w:p>
@@ -352,11 +314,9 @@
           <w:tag w:val="page.hero.body"/>
         </w:sdtPr>
         <w:sdtContent>
-          <w:p>
-            <w:r>
-              <w:t>Considered furniture and useful spaces.</w:t>
-            </w:r>
-          </w:p>
+          <w:r>
+            <w:t>Considered furniture and useful spaces.</w:t>
+          </w:r>
         </w:sdtContent>
       </w:sdt>
     </w:p>
@@ -369,11 +329,9 @@
           <w:tag w:val="page.hero.button"/>
         </w:sdtPr>
         <w:sdtContent>
-          <w:p>
-            <w:r>
-              <w:t>Browse furniture | shop.html</w:t>
-            </w:r>
-          </w:p>
+          <w:r>
+            <w:t>Browse furniture | shop.html</w:t>
+          </w:r>
         </w:sdtContent>
       </w:sdt>
     </w:p>
@@ -391,11 +349,9 @@
           <w:tag w:val="page.id"/>
         </w:sdtPr>
         <w:sdtContent>
-          <w:p>
-            <w:r>
-              <w:t>lookbook</w:t>
-            </w:r>
-          </w:p>
+          <w:r>
+            <w:t>lookbook</w:t>
+          </w:r>
         </w:sdtContent>
       </w:sdt>
     </w:p>
@@ -408,11 +364,9 @@
           <w:tag w:val="page.title"/>
         </w:sdtPr>
         <w:sdtContent>
-          <w:p>
-            <w:r>
-              <w:t>lookbook</w:t>
-            </w:r>
-          </w:p>
+          <w:r>
+            <w:t>lookbook</w:t>
+          </w:r>
         </w:sdtContent>
       </w:sdt>
     </w:p>
@@ -425,11 +379,9 @@
           <w:tag w:val="page.hero.id"/>
         </w:sdtPr>
         <w:sdtContent>
-          <w:p>
-            <w:r>
-              <w:t>lookbook-hero</w:t>
-            </w:r>
-          </w:p>
+          <w:r>
+            <w:t>lookbook-hero</w:t>
+          </w:r>
         </w:sdtContent>
       </w:sdt>
     </w:p>
@@ -442,11 +394,9 @@
           <w:tag w:val="page.hero.heading"/>
         </w:sdtPr>
         <w:sdtContent>
-          <w:p>
-            <w:r>
-              <w:t>See the room before you choose.</w:t>
-            </w:r>
-          </w:p>
+          <w:r>
+            <w:t>See the room before you choose.</w:t>
+          </w:r>
         </w:sdtContent>
       </w:sdt>
     </w:p>
@@ -459,11 +409,9 @@
           <w:tag w:val="page.hero.body"/>
         </w:sdtPr>
         <w:sdtContent>
-          <w:p>
-            <w:r>
-              <w:t>Considered furniture and useful spaces.</w:t>
-            </w:r>
-          </w:p>
+          <w:r>
+            <w:t>Considered furniture and useful spaces.</w:t>
+          </w:r>
         </w:sdtContent>
       </w:sdt>
     </w:p>
@@ -476,11 +424,9 @@
           <w:tag w:val="page.hero.button"/>
         </w:sdtPr>
         <w:sdtContent>
-          <w:p>
-            <w:r>
-              <w:t>Browse furniture | shop.html</w:t>
-            </w:r>
-          </w:p>
+          <w:r>
+            <w:t>Browse furniture | shop.html</w:t>
+          </w:r>
         </w:sdtContent>
       </w:sdt>
     </w:p>
@@ -498,11 +444,9 @@
           <w:tag w:val="page.id"/>
         </w:sdtPr>
         <w:sdtContent>
-          <w:p>
-            <w:r>
-              <w:t>about</w:t>
-            </w:r>
-          </w:p>
+          <w:r>
+            <w:t>about</w:t>
+          </w:r>
         </w:sdtContent>
       </w:sdt>
     </w:p>
@@ -515,11 +459,9 @@
           <w:tag w:val="page.title"/>
         </w:sdtPr>
         <w:sdtContent>
-          <w:p>
-            <w:r>
-              <w:t>about</w:t>
-            </w:r>
-          </w:p>
+          <w:r>
+            <w:t>about</w:t>
+          </w:r>
         </w:sdtContent>
       </w:sdt>
     </w:p>
@@ -532,11 +474,9 @@
           <w:tag w:val="page.hero.id"/>
         </w:sdtPr>
         <w:sdtContent>
-          <w:p>
-            <w:r>
-              <w:t>about-hero</w:t>
-            </w:r>
-          </w:p>
+          <w:r>
+            <w:t>about-hero</w:t>
+          </w:r>
         </w:sdtContent>
       </w:sdt>
     </w:p>
@@ -549,11 +489,9 @@
           <w:tag w:val="page.hero.heading"/>
         </w:sdtPr>
         <w:sdtContent>
-          <w:p>
-            <w:r>
-              <w:t>Good furniture should fit your life.</w:t>
-            </w:r>
-          </w:p>
+          <w:r>
+            <w:t>Good furniture should fit your life.</w:t>
+          </w:r>
         </w:sdtContent>
       </w:sdt>
     </w:p>
@@ -566,11 +504,9 @@
           <w:tag w:val="page.hero.body"/>
         </w:sdtPr>
         <w:sdtContent>
-          <w:p>
-            <w:r>
-              <w:t>Considered furniture and useful spaces.</w:t>
-            </w:r>
-          </w:p>
+          <w:r>
+            <w:t>Considered furniture and useful spaces.</w:t>
+          </w:r>
         </w:sdtContent>
       </w:sdt>
     </w:p>
@@ -583,11 +519,9 @@
           <w:tag w:val="page.hero.button"/>
         </w:sdtPr>
         <w:sdtContent>
-          <w:p>
-            <w:r>
-              <w:t>Browse furniture | shop.html</w:t>
-            </w:r>
-          </w:p>
+          <w:r>
+            <w:t>Browse furniture | shop.html</w:t>
+          </w:r>
         </w:sdtContent>
       </w:sdt>
     </w:p>
@@ -605,11 +539,9 @@
           <w:tag w:val="section.page"/>
         </w:sdtPr>
         <w:sdtContent>
-          <w:p>
-            <w:r>
-              <w:t>shop</w:t>
-            </w:r>
-          </w:p>
+          <w:r>
+            <w:t>shop</w:t>
+          </w:r>
         </w:sdtContent>
       </w:sdt>
     </w:p>
@@ -622,11 +554,9 @@
           <w:tag w:val="section.id"/>
         </w:sdtPr>
         <w:sdtContent>
-          <w:p>
-            <w:r>
-              <w:t>catalogue</w:t>
-            </w:r>
-          </w:p>
+          <w:r>
+            <w:t>catalogue</w:t>
+          </w:r>
         </w:sdtContent>
       </w:sdt>
     </w:p>
@@ -639,11 +569,9 @@
           <w:tag w:val="section.type"/>
         </w:sdtPr>
         <w:sdtContent>
-          <w:p>
-            <w:r>
-              <w:t>shop</w:t>
-            </w:r>
-          </w:p>
+          <w:r>
+            <w:t>shop</w:t>
+          </w:r>
         </w:sdtContent>
       </w:sdt>
     </w:p>
@@ -656,11 +584,9 @@
           <w:tag w:val="section.heading"/>
         </w:sdtPr>
         <w:sdtContent>
-          <w:p>
-            <w:r>
-              <w:t>Our collection</w:t>
-            </w:r>
-          </w:p>
+          <w:r>
+            <w:t>Our collection</w:t>
+          </w:r>
         </w:sdtContent>
       </w:sdt>
     </w:p>
@@ -678,11 +604,9 @@
           <w:tag w:val="section.page"/>
         </w:sdtPr>
         <w:sdtContent>
-          <w:p>
-            <w:r>
-              <w:t>lookbook</w:t>
-            </w:r>
-          </w:p>
+          <w:r>
+            <w:t>lookbook</w:t>
+          </w:r>
         </w:sdtContent>
       </w:sdt>
     </w:p>
@@ -695,11 +619,9 @@
           <w:tag w:val="section.id"/>
         </w:sdtPr>
         <w:sdtContent>
-          <w:p>
-            <w:r>
-              <w:t>rooms</w:t>
-            </w:r>
-          </w:p>
+          <w:r>
+            <w:t>rooms</w:t>
+          </w:r>
         </w:sdtContent>
       </w:sdt>
     </w:p>
@@ -712,11 +634,9 @@
           <w:tag w:val="section.type"/>
         </w:sdtPr>
         <w:sdtContent>
-          <w:p>
-            <w:r>
-              <w:t>gallery</w:t>
-            </w:r>
-          </w:p>
+          <w:r>
+            <w:t>gallery</w:t>
+          </w:r>
         </w:sdtContent>
       </w:sdt>
     </w:p>
@@ -729,11 +649,9 @@
           <w:tag w:val="section.heading"/>
         </w:sdtPr>
         <w:sdtContent>
-          <w:p>
-            <w:r>
-              <w:t>Room inspiration</w:t>
-            </w:r>
-          </w:p>
+          <w:r>
+            <w:t>Room inspiration</w:t>
+          </w:r>
         </w:sdtContent>
       </w:sdt>
     </w:p>
@@ -751,11 +669,9 @@
           <w:tag w:val="section.page"/>
         </w:sdtPr>
         <w:sdtContent>
-          <w:p>
-            <w:r>
-              <w:t>about</w:t>
-            </w:r>
-          </w:p>
+          <w:r>
+            <w:t>about</w:t>
+          </w:r>
         </w:sdtContent>
       </w:sdt>
     </w:p>
@@ -768,11 +684,9 @@
           <w:tag w:val="section.id"/>
         </w:sdtPr>
         <w:sdtContent>
-          <w:p>
-            <w:r>
-              <w:t>help</w:t>
-            </w:r>
-          </w:p>
+          <w:r>
+            <w:t>help</w:t>
+          </w:r>
         </w:sdtContent>
       </w:sdt>
     </w:p>
@@ -785,11 +699,9 @@
           <w:tag w:val="section.type"/>
         </w:sdtPr>
         <w:sdtContent>
-          <w:p>
-            <w:r>
-              <w:t>faq</w:t>
-            </w:r>
-          </w:p>
+          <w:r>
+            <w:t>faq</w:t>
+          </w:r>
         </w:sdtContent>
       </w:sdt>
     </w:p>
@@ -802,11 +714,9 @@
           <w:tag w:val="section.heading"/>
         </w:sdtPr>
         <w:sdtContent>
-          <w:p>
-            <w:r>
-              <w:t>Ordering questions</w:t>
-            </w:r>
-          </w:p>
+          <w:r>
+            <w:t>Ordering questions</w:t>
+          </w:r>
         </w:sdtContent>
       </w:sdt>
     </w:p>
@@ -824,11 +734,9 @@
           <w:tag w:val="section.page"/>
         </w:sdtPr>
         <w:sdtContent>
-          <w:p>
-            <w:r>
-              <w:t>home</w:t>
-            </w:r>
-          </w:p>
+          <w:r>
+            <w:t>home</w:t>
+          </w:r>
         </w:sdtContent>
       </w:sdt>
     </w:p>
@@ -841,11 +749,9 @@
           <w:tag w:val="section.id"/>
         </w:sdtPr>
         <w:sdtContent>
-          <w:p>
-            <w:r>
-              <w:t>values</w:t>
-            </w:r>
-          </w:p>
+          <w:r>
+            <w:t>values</w:t>
+          </w:r>
         </w:sdtContent>
       </w:sdt>
     </w:p>
@@ -858,11 +764,9 @@
           <w:tag w:val="section.type"/>
         </w:sdtPr>
         <w:sdtContent>
-          <w:p>
-            <w:r>
-              <w:t>services</w:t>
-            </w:r>
-          </w:p>
+          <w:r>
+            <w:t>services</w:t>
+          </w:r>
         </w:sdtContent>
       </w:sdt>
     </w:p>
@@ -875,11 +779,9 @@
           <w:tag w:val="section.heading"/>
         </w:sdtPr>
         <w:sdtContent>
-          <w:p>
-            <w:r>
-              <w:t>Choose with purpose</w:t>
-            </w:r>
-          </w:p>
+          <w:r>
+            <w:t>Choose with purpose</w:t>
+          </w:r>
         </w:sdtContent>
       </w:sdt>
     </w:p>
@@ -892,12 +794,10 @@
           <w:tag w:val="section.items"/>
         </w:sdtPr>
         <w:sdtContent>
-          <w:p>
-            <w:r>
-              <w:t>Comfort | A place to settle in.
+          <w:r>
+            <w:t>Comfort | A place to settle in.
 Practicality | Room for everyday life.</w:t>
-            </w:r>
-          </w:p>
+          </w:r>
         </w:sdtContent>
       </w:sdt>
     </w:p>
@@ -915,11 +815,9 @@
           <w:tag w:val="product.page"/>
         </w:sdtPr>
         <w:sdtContent>
-          <w:p>
-            <w:r>
-              <w:t>shop</w:t>
-            </w:r>
-          </w:p>
+          <w:r>
+            <w:t>shop</w:t>
+          </w:r>
         </w:sdtContent>
       </w:sdt>
     </w:p>
@@ -932,11 +830,9 @@
           <w:tag w:val="product.code"/>
         </w:sdtPr>
         <w:sdtContent>
-          <w:p>
-            <w:r>
-              <w:t>RL-SOF-001</w:t>
-            </w:r>
-          </w:p>
+          <w:r>
+            <w:t>RL-SOF-001</w:t>
+          </w:r>
         </w:sdtContent>
       </w:sdt>
     </w:p>
@@ -949,11 +845,9 @@
           <w:tag w:val="product.name"/>
         </w:sdtPr>
         <w:sdtContent>
-          <w:p>
-            <w:r>
-              <w:t>Nia Sofa</w:t>
-            </w:r>
-          </w:p>
+          <w:r>
+            <w:t>Nia Sofa</w:t>
+          </w:r>
         </w:sdtContent>
       </w:sdt>
     </w:p>
@@ -966,11 +860,9 @@
           <w:tag w:val="product.price"/>
         </w:sdtPr>
         <w:sdtContent>
-          <w:p>
-            <w:r>
-              <w:t>48000 | KES</w:t>
-            </w:r>
-          </w:p>
+          <w:r>
+            <w:t>48000 | KES</w:t>
+          </w:r>
         </w:sdtContent>
       </w:sdt>
     </w:p>
@@ -983,11 +875,9 @@
           <w:tag w:val="product.description"/>
         </w:sdtPr>
         <w:sdtContent>
-          <w:p>
-            <w:r>
-              <w:t>Illustrative furniture for your home.</w:t>
-            </w:r>
-          </w:p>
+          <w:r>
+            <w:t>Illustrative furniture for your home.</w:t>
+          </w:r>
         </w:sdtContent>
       </w:sdt>
     </w:p>
@@ -1000,11 +890,9 @@
           <w:tag w:val="product.category"/>
         </w:sdtPr>
         <w:sdtContent>
-          <w:p>
-            <w:r>
-              <w:t>Furniture</w:t>
-            </w:r>
-          </w:p>
+          <w:r>
+            <w:t>Furniture</w:t>
+          </w:r>
         </w:sdtContent>
       </w:sdt>
     </w:p>
@@ -1017,11 +905,9 @@
           <w:tag w:val="product.options"/>
         </w:sdtPr>
         <w:sdtContent>
-          <w:p>
-            <w:r>
-              <w:t>Size: Standard; Colour: Sand, Charcoal</w:t>
-            </w:r>
-          </w:p>
+          <w:r>
+            <w:t>Size: Standard; Colour: Sand, Charcoal</w:t>
+          </w:r>
         </w:sdtContent>
       </w:sdt>
     </w:p>
@@ -1034,11 +920,9 @@
           <w:tag w:val="product.available"/>
         </w:sdtPr>
         <w:sdtContent>
-          <w:p>
-            <w:r>
-              <w:t>available</w:t>
-            </w:r>
-          </w:p>
+          <w:r>
+            <w:t>available</w:t>
+          </w:r>
         </w:sdtContent>
       </w:sdt>
     </w:p>
@@ -1056,11 +940,9 @@
           <w:tag w:val="product.page"/>
         </w:sdtPr>
         <w:sdtContent>
-          <w:p>
-            <w:r>
-              <w:t>shop</w:t>
-            </w:r>
-          </w:p>
+          <w:r>
+            <w:t>shop</w:t>
+          </w:r>
         </w:sdtContent>
       </w:sdt>
     </w:p>
@@ -1073,11 +955,9 @@
           <w:tag w:val="product.code"/>
         </w:sdtPr>
         <w:sdtContent>
-          <w:p>
-            <w:r>
-              <w:t>RL-DIN-002</w:t>
-            </w:r>
-          </w:p>
+          <w:r>
+            <w:t>RL-DIN-002</w:t>
+          </w:r>
         </w:sdtContent>
       </w:sdt>
     </w:p>
@@ -1090,11 +970,9 @@
           <w:tag w:val="product.name"/>
         </w:sdtPr>
         <w:sdtContent>
-          <w:p>
-            <w:r>
-              <w:t>Pamoja Dining Table</w:t>
-            </w:r>
-          </w:p>
+          <w:r>
+            <w:t>Pamoja Dining Table</w:t>
+          </w:r>
         </w:sdtContent>
       </w:sdt>
     </w:p>
@@ -1107,11 +985,9 @@
           <w:tag w:val="product.price"/>
         </w:sdtPr>
         <w:sdtContent>
-          <w:p>
-            <w:r>
-              <w:t>32000 | KES</w:t>
-            </w:r>
-          </w:p>
+          <w:r>
+            <w:t>32000 | KES</w:t>
+          </w:r>
         </w:sdtContent>
       </w:sdt>
     </w:p>
@@ -1124,11 +1000,9 @@
           <w:tag w:val="product.description"/>
         </w:sdtPr>
         <w:sdtContent>
-          <w:p>
-            <w:r>
-              <w:t>Illustrative furniture for your home.</w:t>
-            </w:r>
-          </w:p>
+          <w:r>
+            <w:t>Illustrative furniture for your home.</w:t>
+          </w:r>
         </w:sdtContent>
       </w:sdt>
     </w:p>
@@ -1141,11 +1015,9 @@
           <w:tag w:val="product.category"/>
         </w:sdtPr>
         <w:sdtContent>
-          <w:p>
-            <w:r>
-              <w:t>Furniture</w:t>
-            </w:r>
-          </w:p>
+          <w:r>
+            <w:t>Furniture</w:t>
+          </w:r>
         </w:sdtContent>
       </w:sdt>
     </w:p>
@@ -1158,11 +1030,9 @@
           <w:tag w:val="product.options"/>
         </w:sdtPr>
         <w:sdtContent>
-          <w:p>
-            <w:r>
-              <w:t>Size: Standard; Colour: Sand, Charcoal</w:t>
-            </w:r>
-          </w:p>
+          <w:r>
+            <w:t>Size: Standard; Colour: Sand, Charcoal</w:t>
+          </w:r>
         </w:sdtContent>
       </w:sdt>
     </w:p>
@@ -1175,11 +1045,9 @@
           <w:tag w:val="product.available"/>
         </w:sdtPr>
         <w:sdtContent>
-          <w:p>
-            <w:r>
-              <w:t>available</w:t>
-            </w:r>
-          </w:p>
+          <w:r>
+            <w:t>available</w:t>
+          </w:r>
         </w:sdtContent>
       </w:sdt>
     </w:p>
@@ -1197,11 +1065,9 @@
           <w:tag w:val="product.page"/>
         </w:sdtPr>
         <w:sdtContent>
-          <w:p>
-            <w:r>
-              <w:t>shop</w:t>
-            </w:r>
-          </w:p>
+          <w:r>
+            <w:t>shop</w:t>
+          </w:r>
         </w:sdtContent>
       </w:sdt>
     </w:p>
@@ -1214,11 +1080,9 @@
           <w:tag w:val="product.code"/>
         </w:sdtPr>
         <w:sdtContent>
-          <w:p>
-            <w:r>
-              <w:t>RL-OFF-003</w:t>
-            </w:r>
-          </w:p>
+          <w:r>
+            <w:t>RL-OFF-003</w:t>
+          </w:r>
         </w:sdtContent>
       </w:sdt>
     </w:p>
@@ -1231,11 +1095,9 @@
           <w:tag w:val="product.name"/>
         </w:sdtPr>
         <w:sdtContent>
-          <w:p>
-            <w:r>
-              <w:t>Kazi Office Desk</w:t>
-            </w:r>
-          </w:p>
+          <w:r>
+            <w:t>Kazi Office Desk</w:t>
+          </w:r>
         </w:sdtContent>
       </w:sdt>
     </w:p>
@@ -1248,11 +1110,9 @@
           <w:tag w:val="product.price"/>
         </w:sdtPr>
         <w:sdtContent>
-          <w:p>
-            <w:r>
-              <w:t>18500 | KES</w:t>
-            </w:r>
-          </w:p>
+          <w:r>
+            <w:t>18500 | KES</w:t>
+          </w:r>
         </w:sdtContent>
       </w:sdt>
     </w:p>
@@ -1265,11 +1125,9 @@
           <w:tag w:val="product.description"/>
         </w:sdtPr>
         <w:sdtContent>
-          <w:p>
-            <w:r>
-              <w:t>Illustrative furniture for your home.</w:t>
-            </w:r>
-          </w:p>
+          <w:r>
+            <w:t>Illustrative furniture for your home.</w:t>
+          </w:r>
         </w:sdtContent>
       </w:sdt>
     </w:p>
@@ -1282,11 +1140,9 @@
           <w:tag w:val="product.category"/>
         </w:sdtPr>
         <w:sdtContent>
-          <w:p>
-            <w:r>
-              <w:t>Furniture</w:t>
-            </w:r>
-          </w:p>
+          <w:r>
+            <w:t>Furniture</w:t>
+          </w:r>
         </w:sdtContent>
       </w:sdt>
     </w:p>
@@ -1299,11 +1155,9 @@
           <w:tag w:val="product.options"/>
         </w:sdtPr>
         <w:sdtContent>
-          <w:p>
-            <w:r>
-              <w:t>Size: Standard; Colour: Sand, Charcoal</w:t>
-            </w:r>
-          </w:p>
+          <w:r>
+            <w:t>Size: Standard; Colour: Sand, Charcoal</w:t>
+          </w:r>
         </w:sdtContent>
       </w:sdt>
     </w:p>
@@ -1316,11 +1170,9 @@
           <w:tag w:val="product.available"/>
         </w:sdtPr>
         <w:sdtContent>
-          <w:p>
-            <w:r>
-              <w:t>available</w:t>
-            </w:r>
-          </w:p>
+          <w:r>
+            <w:t>available</w:t>
+          </w:r>
         </w:sdtContent>
       </w:sdt>
     </w:p>
@@ -1338,11 +1190,9 @@
           <w:tag w:val="product.page"/>
         </w:sdtPr>
         <w:sdtContent>
-          <w:p>
-            <w:r>
-              <w:t>shop</w:t>
-            </w:r>
-          </w:p>
+          <w:r>
+            <w:t>shop</w:t>
+          </w:r>
         </w:sdtContent>
       </w:sdt>
     </w:p>
@@ -1355,11 +1205,9 @@
           <w:tag w:val="product.code"/>
         </w:sdtPr>
         <w:sdtContent>
-          <w:p>
-            <w:r>
-              <w:t>RL-BED-004</w:t>
-            </w:r>
-          </w:p>
+          <w:r>
+            <w:t>RL-BED-004</w:t>
+          </w:r>
         </w:sdtContent>
       </w:sdt>
     </w:p>
@@ -1372,11 +1220,9 @@
           <w:tag w:val="product.name"/>
         </w:sdtPr>
         <w:sdtContent>
-          <w:p>
-            <w:r>
-              <w:t>Tulivu Bed</w:t>
-            </w:r>
-          </w:p>
+          <w:r>
+            <w:t>Tulivu Bed</w:t>
+          </w:r>
         </w:sdtContent>
       </w:sdt>
     </w:p>
@@ -1389,11 +1235,9 @@
           <w:tag w:val="product.price"/>
         </w:sdtPr>
         <w:sdtContent>
-          <w:p>
-            <w:r>
-              <w:t>38500 | KES</w:t>
-            </w:r>
-          </w:p>
+          <w:r>
+            <w:t>38500 | KES</w:t>
+          </w:r>
         </w:sdtContent>
       </w:sdt>
     </w:p>
@@ -1406,11 +1250,9 @@
           <w:tag w:val="product.description"/>
         </w:sdtPr>
         <w:sdtContent>
-          <w:p>
-            <w:r>
-              <w:t>Illustrative furniture for your home.</w:t>
-            </w:r>
-          </w:p>
+          <w:r>
+            <w:t>Illustrative furniture for your home.</w:t>
+          </w:r>
         </w:sdtContent>
       </w:sdt>
     </w:p>
@@ -1423,11 +1265,9 @@
           <w:tag w:val="product.category"/>
         </w:sdtPr>
         <w:sdtContent>
-          <w:p>
-            <w:r>
-              <w:t>Furniture</w:t>
-            </w:r>
-          </w:p>
+          <w:r>
+            <w:t>Furniture</w:t>
+          </w:r>
         </w:sdtContent>
       </w:sdt>
     </w:p>
@@ -1440,11 +1280,9 @@
           <w:tag w:val="product.options"/>
         </w:sdtPr>
         <w:sdtContent>
-          <w:p>
-            <w:r>
-              <w:t>Size: Standard; Colour: Sand, Charcoal</w:t>
-            </w:r>
-          </w:p>
+          <w:r>
+            <w:t>Size: Standard; Colour: Sand, Charcoal</w:t>
+          </w:r>
         </w:sdtContent>
       </w:sdt>
     </w:p>
@@ -1457,11 +1295,9 @@
           <w:tag w:val="product.available"/>
         </w:sdtPr>
         <w:sdtContent>
-          <w:p>
-            <w:r>
-              <w:t>available</w:t>
-            </w:r>
-          </w:p>
+          <w:r>
+            <w:t>available</w:t>
+          </w:r>
         </w:sdtContent>
       </w:sdt>
     </w:p>
@@ -1479,11 +1315,9 @@
           <w:tag w:val="product.page"/>
         </w:sdtPr>
         <w:sdtContent>
-          <w:p>
-            <w:r>
-              <w:t>shop</w:t>
-            </w:r>
-          </w:p>
+          <w:r>
+            <w:t>shop</w:t>
+          </w:r>
         </w:sdtContent>
       </w:sdt>
     </w:p>
@@ -1496,11 +1330,9 @@
           <w:tag w:val="product.code"/>
         </w:sdtPr>
         <w:sdtContent>
-          <w:p>
-            <w:r>
-              <w:t>RL-STO-005</w:t>
-            </w:r>
-          </w:p>
+          <w:r>
+            <w:t>RL-STO-005</w:t>
+          </w:r>
         </w:sdtContent>
       </w:sdt>
     </w:p>
@@ -1513,11 +1345,9 @@
           <w:tag w:val="product.name"/>
         </w:sdtPr>
         <w:sdtContent>
-          <w:p>
-            <w:r>
-              <w:t>Nyumba TV Stand</w:t>
-            </w:r>
-          </w:p>
+          <w:r>
+            <w:t>Nyumba TV Stand</w:t>
+          </w:r>
         </w:sdtContent>
       </w:sdt>
     </w:p>
@@ -1530,11 +1360,9 @@
           <w:tag w:val="product.price"/>
         </w:sdtPr>
         <w:sdtContent>
-          <w:p>
-            <w:r>
-              <w:t>15000 | KES</w:t>
-            </w:r>
-          </w:p>
+          <w:r>
+            <w:t>15000 | KES</w:t>
+          </w:r>
         </w:sdtContent>
       </w:sdt>
     </w:p>
@@ -1547,11 +1375,9 @@
           <w:tag w:val="product.description"/>
         </w:sdtPr>
         <w:sdtContent>
-          <w:p>
-            <w:r>
-              <w:t>Illustrative furniture for your home.</w:t>
-            </w:r>
-          </w:p>
+          <w:r>
+            <w:t>Illustrative furniture for your home.</w:t>
+          </w:r>
         </w:sdtContent>
       </w:sdt>
     </w:p>
@@ -1564,11 +1390,9 @@
           <w:tag w:val="product.category"/>
         </w:sdtPr>
         <w:sdtContent>
-          <w:p>
-            <w:r>
-              <w:t>Furniture</w:t>
-            </w:r>
-          </w:p>
+          <w:r>
+            <w:t>Furniture</w:t>
+          </w:r>
         </w:sdtContent>
       </w:sdt>
     </w:p>
@@ -1581,11 +1405,9 @@
           <w:tag w:val="product.options"/>
         </w:sdtPr>
         <w:sdtContent>
-          <w:p>
-            <w:r>
-              <w:t>Size: Standard; Colour: Sand, Charcoal</w:t>
-            </w:r>
-          </w:p>
+          <w:r>
+            <w:t>Size: Standard; Colour: Sand, Charcoal</w:t>
+          </w:r>
         </w:sdtContent>
       </w:sdt>
     </w:p>
@@ -1598,11 +1420,9 @@
           <w:tag w:val="product.available"/>
         </w:sdtPr>
         <w:sdtContent>
-          <w:p>
-            <w:r>
-              <w:t>available</w:t>
-            </w:r>
-          </w:p>
+          <w:r>
+            <w:t>available</w:t>
+          </w:r>
         </w:sdtContent>
       </w:sdt>
     </w:p>
@@ -1620,11 +1440,9 @@
           <w:tag w:val="product.page"/>
         </w:sdtPr>
         <w:sdtContent>
-          <w:p>
-            <w:r>
-              <w:t>shop</w:t>
-            </w:r>
-          </w:p>
+          <w:r>
+            <w:t>shop</w:t>
+          </w:r>
         </w:sdtContent>
       </w:sdt>
     </w:p>
@@ -1637,11 +1455,9 @@
           <w:tag w:val="product.code"/>
         </w:sdtPr>
         <w:sdtContent>
-          <w:p>
-            <w:r>
-              <w:t>RL-STO-006</w:t>
-            </w:r>
-          </w:p>
+          <w:r>
+            <w:t>RL-STO-006</w:t>
+          </w:r>
         </w:sdtContent>
       </w:sdt>
     </w:p>
@@ -1654,11 +1470,9 @@
           <w:tag w:val="product.name"/>
         </w:sdtPr>
         <w:sdtContent>
-          <w:p>
-            <w:r>
-              <w:t>Soma Bookshelf</w:t>
-            </w:r>
-          </w:p>
+          <w:r>
+            <w:t>Soma Bookshelf</w:t>
+          </w:r>
         </w:sdtContent>
       </w:sdt>
     </w:p>
@@ -1671,11 +1485,9 @@
           <w:tag w:val="product.price"/>
         </w:sdtPr>
         <w:sdtContent>
-          <w:p>
-            <w:r>
-              <w:t>8500 | KES</w:t>
-            </w:r>
-          </w:p>
+          <w:r>
+            <w:t>8500 | KES</w:t>
+          </w:r>
         </w:sdtContent>
       </w:sdt>
     </w:p>
@@ -1688,11 +1500,9 @@
           <w:tag w:val="product.description"/>
         </w:sdtPr>
         <w:sdtContent>
-          <w:p>
-            <w:r>
-              <w:t>Illustrative furniture for your home.</w:t>
-            </w:r>
-          </w:p>
+          <w:r>
+            <w:t>Illustrative furniture for your home.</w:t>
+          </w:r>
         </w:sdtContent>
       </w:sdt>
     </w:p>
@@ -1705,11 +1515,9 @@
           <w:tag w:val="product.category"/>
         </w:sdtPr>
         <w:sdtContent>
-          <w:p>
-            <w:r>
-              <w:t>Furniture</w:t>
-            </w:r>
-          </w:p>
+          <w:r>
+            <w:t>Furniture</w:t>
+          </w:r>
         </w:sdtContent>
       </w:sdt>
     </w:p>
@@ -1722,11 +1530,9 @@
           <w:tag w:val="product.options"/>
         </w:sdtPr>
         <w:sdtContent>
-          <w:p>
-            <w:r>
-              <w:t>Size: Standard; Colour: Sand, Charcoal</w:t>
-            </w:r>
-          </w:p>
+          <w:r>
+            <w:t>Size: Standard; Colour: Sand, Charcoal</w:t>
+          </w:r>
         </w:sdtContent>
       </w:sdt>
     </w:p>
@@ -1739,11 +1545,9 @@
           <w:tag w:val="product.available"/>
         </w:sdtPr>
         <w:sdtContent>
-          <w:p>
-            <w:r>
-              <w:t>available</w:t>
-            </w:r>
-          </w:p>
+          <w:r>
+            <w:t>available</w:t>
+          </w:r>
         </w:sdtContent>
       </w:sdt>
     </w:p>
@@ -1761,11 +1565,9 @@
           <w:tag w:val="gallery.section"/>
         </w:sdtPr>
         <w:sdtContent>
-          <w:p>
-            <w:r>
-              <w:t>rooms</w:t>
-            </w:r>
-          </w:p>
+          <w:r>
+            <w:t>rooms</w:t>
+          </w:r>
         </w:sdtContent>
       </w:sdt>
     </w:p>
@@ -1778,11 +1580,9 @@
           <w:tag w:val="gallery.images"/>
         </w:sdtPr>
         <w:sdtContent>
-          <w:p>
-            <w:r>
-              <w:t>https://images.example/room.jpg | A comfortable living room | Room to relax</w:t>
-            </w:r>
-          </w:p>
+          <w:r>
+            <w:t>https://images.example/room.jpg | A comfortable living room | Room to relax</w:t>
+          </w:r>
         </w:sdtContent>
       </w:sdt>
     </w:p>
@@ -1795,11 +1595,9 @@
           <w:tag w:val="gallery.credits"/>
         </w:sdtPr>
         <w:sdtContent>
-          <w:p>
-            <w:r>
-              <w:t>https://images.example/room.jpg | Demo Photographer | https://example.com/photo | CC0</w:t>
-            </w:r>
-          </w:p>
+          <w:r>
+            <w:t>https://images.example/room.jpg | Demo Photographer | https://example.com/photo | CC0</w:t>
+          </w:r>
         </w:sdtContent>
       </w:sdt>
     </w:p>
@@ -1817,11 +1615,9 @@
           <w:tag w:val="faq.section"/>
         </w:sdtPr>
         <w:sdtContent>
-          <w:p>
-            <w:r>
-              <w:t>help</w:t>
-            </w:r>
-          </w:p>
+          <w:r>
+            <w:t>help</w:t>
+          </w:r>
         </w:sdtContent>
       </w:sdt>
     </w:p>
@@ -1834,12 +1630,10 @@
           <w:tag w:val="faq.items"/>
         </w:sdtPr>
         <w:sdtContent>
-          <w:p>
-            <w:r>
-              <w:t>Can I pay here? | No payments are taken on this demonstration.
+          <w:r>
+            <w:t>Can I pay here? | No payments are taken on this demonstration.
 How do I order? | Prepare a shopping list.</w:t>
-            </w:r>
-          </w:p>
+          </w:r>
         </w:sdtContent>
       </w:sdt>
     </w:p>

</xml_diff>

<commit_message>
Rebuild verified photo-backed Word and PDF examples
</commit_message>
<xml_diff>
--- a/public/templates/Rama_Living_Completed_Example.docx
+++ b/public/templates/Rama_Living_Completed_Example.docx
@@ -3,17 +3,109 @@
 <w:document xmlns:wpc="http://schemas.microsoft.com/office/word/2010/wordprocessingCanvas" xmlns:mo="http://schemas.microsoft.com/office/mac/office/2008/main" xmlns:mc="http://schemas.openxmlformats.org/markup-compatibility/2006" xmlns:mv="urn:schemas-microsoft-com:mac:vml" xmlns:o="urn:schemas-microsoft-com:office:office" xmlns:r="http://schemas.openxmlformats.org/officeDocument/2006/relationships" xmlns:m="http://schemas.openxmlformats.org/officeDocument/2006/math" xmlns:v="urn:schemas-microsoft-com:vml" xmlns:wp14="http://schemas.microsoft.com/office/word/2010/wordprocessingDrawing" xmlns:wp="http://schemas.openxmlformats.org/drawingml/2006/wordprocessingDrawing" xmlns:w10="urn:schemas-microsoft-com:office:word" xmlns:w="http://schemas.openxmlformats.org/wordprocessingml/2006/main" xmlns:w14="http://schemas.microsoft.com/office/word/2010/wordml" xmlns:wpg="http://schemas.microsoft.com/office/word/2010/wordprocessingGroup" xmlns:wpi="http://schemas.microsoft.com/office/word/2010/wordprocessingInk" xmlns:wne="http://schemas.microsoft.com/office/word/2006/wordml" xmlns:wps="http://schemas.microsoft.com/office/word/2010/wordprocessingShape" mc:Ignorable="w14 wp14">
   <w:body>
     <w:p>
+      <w:pPr>
+        <w:pStyle w:val="Title"/>
+      </w:pPr>
       <w:r>
-        <w:t>Website content template</w:t>
+        <w:t>Rama Living</w:t>
       </w:r>
     </w:p>
     <w:p>
       <w:r>
-        <w:t/>
+        <w:t>A complete website from one document</w:t>
       </w:r>
+    </w:p>
+    <w:p>
+      <w:r>
+        <w:drawing>
+          <wp:inline xmlns:a="http://schemas.openxmlformats.org/drawingml/2006/main" xmlns:pic="http://schemas.openxmlformats.org/drawingml/2006/picture">
+            <wp:extent cx="4574079" cy="3048000"/>
+            <wp:docPr id="1" name="Picture 1"/>
+            <wp:cNvGraphicFramePr>
+              <a:graphicFrameLocks noChangeAspect="1"/>
+            </wp:cNvGraphicFramePr>
+            <a:graphic>
+              <a:graphicData uri="http://schemas.openxmlformats.org/drawingml/2006/picture">
+                <pic:pic>
+                  <pic:nvPicPr>
+                    <pic:cNvPr id="0" name="living.jpg"/>
+                    <pic:cNvPicPr/>
+                  </pic:nvPicPr>
+                  <pic:blipFill>
+                    <a:blip r:embed="rId9"/>
+                    <a:stretch>
+                      <a:fillRect/>
+                    </a:stretch>
+                  </pic:blipFill>
+                  <pic:spPr>
+                    <a:xfrm>
+                      <a:off x="0" y="0"/>
+                      <a:ext cx="4574079" cy="3048000"/>
+                    </a:xfrm>
+                    <a:prstGeom prst="rect"/>
+                  </pic:spPr>
+                </pic:pic>
+              </a:graphicData>
+            </a:graphic>
+          </wp:inline>
+        </w:drawing>
+      </w:r>
+    </w:p>
+    <w:p>
+      <w:r>
+        <w:t>Download this Word or PDF example, then open Rama Studio &gt; Brief &gt; Upload completed template. Review the details and choose Create website from document.</w:t>
+      </w:r>
+    </w:p>
+    <w:p>
+      <w:r>
+        <w:t>Both formats create the same four pages: Home, Shop, Lookbook and About &amp; Help. Six example products include photographs, prices and options. The lookbook includes nine credited CC0 photographs.</w:t>
+      </w:r>
+    </w:p>
+    <w:p>
+      <w:r>
+        <w:t>Photos are embedded here as previews. The website reads the direct HTTPS image links in the fields. Copies are hosted with Rama Studio, so it does not depend on the original photo sites loading.</w:t>
+      </w:r>
+    </w:p>
+    <w:p>
+      <w:r>
+        <w:t>This is a fictional showroom. Prices are illustrative. Room photographs provide inspiration and do not represent exact products for sale. Keep the PDF interactive when saving: printing to PDF removes its import fields.</w:t>
+      </w:r>
+    </w:p>
+    <w:p>
+      <w:r>
+        <w:br w:type="page"/>
+      </w:r>
+    </w:p>
+    <w:p>
+      <w:pPr>
+        <w:pStyle w:val="Heading1"/>
+      </w:pPr>
+      <w:r>
+        <w:t>Your business</w:t>
+      </w:r>
+    </w:p>
+    <w:p>
+      <w:r>
+        <w:t>Shared business details, appearance and navigation</w:t>
+      </w:r>
+    </w:p>
+    <w:p>
+      <w:pPr>
+        <w:keepNext/>
+      </w:pPr>
+      <w:r>
+        <w:rPr>
+          <w:b/>
+        </w:rPr>
+        <w:t>Business name</w:t>
+      </w:r>
+    </w:p>
+    <w:p>
       <w:sdt>
         <w:sdtPr>
+          <w:alias w:val="Business name"/>
           <w:tag w:val="business.name"/>
+          <w:text w:multiLine="1"/>
         </w:sdtPr>
         <w:sdtContent>
           <w:r>
@@ -23,42 +115,72 @@
       </w:sdt>
     </w:p>
     <w:p>
+      <w:pPr>
+        <w:keepNext/>
+      </w:pPr>
       <w:r>
-        <w:t/>
+        <w:rPr>
+          <w:b/>
+        </w:rPr>
+        <w:t>What your business does</w:t>
       </w:r>
+    </w:p>
+    <w:p>
       <w:sdt>
         <w:sdtPr>
+          <w:alias w:val="What your business does"/>
           <w:tag w:val="business.description"/>
+          <w:text w:multiLine="1"/>
         </w:sdtPr>
         <w:sdtContent>
           <w:r>
-            <w:t>Furniture for everyday life.</w:t>
+            <w:t>Thoughtful furniture for the rooms you live in. Explore comfortable seating, useful workspaces and simple storage.</w:t>
           </w:r>
         </w:sdtContent>
       </w:sdt>
     </w:p>
     <w:p>
+      <w:pPr>
+        <w:keepNext/>
+      </w:pPr>
       <w:r>
-        <w:t/>
+        <w:rPr>
+          <w:b/>
+        </w:rPr>
+        <w:t>Services or categories</w:t>
       </w:r>
+    </w:p>
+    <w:p>
       <w:sdt>
         <w:sdtPr>
+          <w:alias w:val="Services or categories"/>
           <w:tag w:val="business.services"/>
+          <w:text w:multiLine="1"/>
         </w:sdtPr>
         <w:sdtContent>
           <w:r>
-            <w:t>Living room, Office</w:t>
+            <w:t>Living room, Dining, Home office, Bedroom, Storage</w:t>
           </w:r>
         </w:sdtContent>
       </w:sdt>
     </w:p>
     <w:p>
+      <w:pPr>
+        <w:keepNext/>
+      </w:pPr>
       <w:r>
-        <w:t/>
+        <w:rPr>
+          <w:b/>
+        </w:rPr>
+        <w:t>Brand colours</w:t>
       </w:r>
+    </w:p>
+    <w:p>
       <w:sdt>
         <w:sdtPr>
+          <w:alias w:val="Brand colours"/>
           <w:tag w:val="brand.colors"/>
+          <w:text w:multiLine="1"/>
         </w:sdtPr>
         <w:sdtContent>
           <w:r>
@@ -68,12 +190,22 @@
       </w:sdt>
     </w:p>
     <w:p>
+      <w:pPr>
+        <w:keepNext/>
+      </w:pPr>
       <w:r>
-        <w:t/>
+        <w:rPr>
+          <w:b/>
+        </w:rPr>
+        <w:t>Font direction</w:t>
       </w:r>
+    </w:p>
+    <w:p>
       <w:sdt>
         <w:sdtPr>
+          <w:alias w:val="Font direction"/>
           <w:tag w:val="brand.font"/>
+          <w:text w:multiLine="1"/>
         </w:sdtPr>
         <w:sdtContent>
           <w:r>
@@ -83,12 +215,22 @@
       </w:sdt>
     </w:p>
     <w:p>
+      <w:pPr>
+        <w:keepNext/>
+      </w:pPr>
       <w:r>
-        <w:t/>
+        <w:rPr>
+          <w:b/>
+        </w:rPr>
+        <w:t>Home page ID</w:t>
       </w:r>
+    </w:p>
+    <w:p>
       <w:sdt>
         <w:sdtPr>
+          <w:alias w:val="Home page ID"/>
           <w:tag w:val="site.home"/>
+          <w:text w:multiLine="1"/>
         </w:sdtPr>
         <w:sdtContent>
           <w:r>
@@ -98,65 +240,217 @@
       </w:sdt>
     </w:p>
     <w:p>
+      <w:pPr>
+        <w:keepNext/>
+      </w:pPr>
       <w:r>
-        <w:t/>
+        <w:rPr>
+          <w:b/>
+        </w:rPr>
+        <w:t>Pages in navigation order</w:t>
       </w:r>
+    </w:p>
+    <w:p>
       <w:sdt>
         <w:sdtPr>
+          <w:alias w:val="Pages in navigation order"/>
           <w:tag w:val="site.pages"/>
+          <w:text w:multiLine="1"/>
         </w:sdtPr>
         <w:sdtContent>
           <w:r>
-            <w:t>home | Home | index.html
-shop | Shop | shop.html
-lookbook | Lookbook | lookbook.html
-about | About &amp; Help | about.html</w:t>
+            <w:t>home | Home | index.html</w:t>
+          </w:r>
+          <w:r>
+            <w:br/>
+            <w:t>shop | Shop | shop.html</w:t>
+          </w:r>
+          <w:r>
+            <w:br/>
+            <w:t>lookbook | Lookbook | lookbook.html</w:t>
+          </w:r>
+          <w:r>
+            <w:br/>
+            <w:t>about | About &amp; Help | about.html</w:t>
           </w:r>
         </w:sdtContent>
       </w:sdt>
     </w:p>
     <w:p>
+      <w:pPr>
+        <w:keepNext/>
+      </w:pPr>
       <w:r>
-        <w:t/>
+        <w:rPr>
+          <w:b/>
+        </w:rPr>
+        <w:t>Footer text</w:t>
       </w:r>
+    </w:p>
+    <w:p>
       <w:sdt>
         <w:sdtPr>
+          <w:alias w:val="Footer text"/>
           <w:tag w:val="footer.text"/>
+          <w:text w:multiLine="1"/>
         </w:sdtPr>
         <w:sdtContent>
           <w:r>
-            <w:t>Made for everyday living.</w:t>
+            <w:t>Make room for everyday living.</w:t>
+          </w:r>
+          <w:r>
+            <w:br/>
+            <w:t>Rama Living is a fictional furniture brand used to demonstrate Rama Studio.</w:t>
           </w:r>
         </w:sdtContent>
       </w:sdt>
     </w:p>
     <w:p>
+      <w:pPr>
+        <w:keepNext/>
+      </w:pPr>
       <w:r>
-        <w:t/>
+        <w:rPr>
+          <w:b/>
+        </w:rPr>
+        <w:t>Business or demonstration notice</w:t>
       </w:r>
+    </w:p>
+    <w:p>
       <w:sdt>
         <w:sdtPr>
+          <w:alias w:val="Business or demonstration notice"/>
           <w:tag w:val="site.notice"/>
+          <w:text w:multiLine="1"/>
         </w:sdtPr>
         <w:sdtContent>
           <w:r>
-            <w:t>Fictional showroom. Prices are illustrative.</w:t>
+            <w:t>Fictional showroom. Prices and products are illustrative. CC0 photographs show room inspiration, not the exact products offered.</w:t>
           </w:r>
         </w:sdtContent>
       </w:sdt>
     </w:p>
     <w:p>
+      <w:pPr>
+        <w:keepNext/>
+      </w:pPr>
+      <w:r>
+        <w:rPr>
+          <w:b/>
+        </w:rPr>
+        <w:t>Main website goal</w:t>
+      </w:r>
+    </w:p>
+    <w:p>
+      <w:sdt>
+        <w:sdtPr>
+          <w:alias w:val="Main website goal"/>
+          <w:tag w:val="business.goal"/>
+          <w:text w:multiLine="1"/>
+        </w:sdtPr>
+        <w:sdtContent>
+          <w:r>
+            <w:t>Browse furniture and prepare a shopping list.</w:t>
+          </w:r>
+        </w:sdtContent>
+      </w:sdt>
+    </w:p>
+    <w:p>
+      <w:pPr>
+        <w:keepNext/>
+      </w:pPr>
+      <w:r>
+        <w:rPr>
+          <w:b/>
+        </w:rPr>
+        <w:t>Website language and direction</w:t>
+      </w:r>
+    </w:p>
+    <w:p>
+      <w:sdt>
+        <w:sdtPr>
+          <w:alias w:val="Website language and direction"/>
+          <w:tag w:val="site.language"/>
+          <w:text w:multiLine="1"/>
+        </w:sdtPr>
+        <w:sdtContent>
+          <w:r>
+            <w:t>en</w:t>
+          </w:r>
+        </w:sdtContent>
+      </w:sdt>
+    </w:p>
+    <w:p>
+      <w:r>
+        <w:br w:type="page"/>
+      </w:r>
+    </w:p>
+    <w:p>
+      <w:pPr>
+        <w:pStyle w:val="Heading1"/>
+      </w:pPr>
       <w:r>
         <w:t>Page content</w:t>
       </w:r>
     </w:p>
     <w:p>
       <w:r>
-        <w:t/>
+        <w:t>home</w:t>
       </w:r>
+    </w:p>
+    <w:p>
+      <w:r>
+        <w:drawing>
+          <wp:inline xmlns:a="http://schemas.openxmlformats.org/drawingml/2006/main" xmlns:pic="http://schemas.openxmlformats.org/drawingml/2006/picture">
+            <wp:extent cx="2763506" cy="1841500"/>
+            <wp:docPr id="2" name="Picture 2"/>
+            <wp:cNvGraphicFramePr>
+              <a:graphicFrameLocks noChangeAspect="1"/>
+            </wp:cNvGraphicFramePr>
+            <a:graphic>
+              <a:graphicData uri="http://schemas.openxmlformats.org/drawingml/2006/picture">
+                <pic:pic>
+                  <pic:nvPicPr>
+                    <pic:cNvPr id="0" name="living.jpg"/>
+                    <pic:cNvPicPr/>
+                  </pic:nvPicPr>
+                  <pic:blipFill>
+                    <a:blip r:embed="rId9"/>
+                    <a:stretch>
+                      <a:fillRect/>
+                    </a:stretch>
+                  </pic:blipFill>
+                  <pic:spPr>
+                    <a:xfrm>
+                      <a:off x="0" y="0"/>
+                      <a:ext cx="2763506" cy="1841500"/>
+                    </a:xfrm>
+                    <a:prstGeom prst="rect"/>
+                  </pic:spPr>
+                </pic:pic>
+              </a:graphicData>
+            </a:graphic>
+          </wp:inline>
+        </w:drawing>
+      </w:r>
+    </w:p>
+    <w:p>
+      <w:pPr>
+        <w:keepNext/>
+      </w:pPr>
+      <w:r>
+        <w:rPr>
+          <w:b/>
+        </w:rPr>
+        <w:t>Page ID</w:t>
+      </w:r>
+    </w:p>
+    <w:p>
       <w:sdt>
         <w:sdtPr>
+          <w:alias w:val="Page ID"/>
           <w:tag w:val="page.id"/>
+          <w:text w:multiLine="1"/>
         </w:sdtPr>
         <w:sdtContent>
           <w:r>
@@ -166,12 +460,22 @@
       </w:sdt>
     </w:p>
     <w:p>
+      <w:pPr>
+        <w:keepNext/>
+      </w:pPr>
       <w:r>
-        <w:t/>
+        <w:rPr>
+          <w:b/>
+        </w:rPr>
+        <w:t>Page title for search</w:t>
       </w:r>
+    </w:p>
+    <w:p>
       <w:sdt>
         <w:sdtPr>
+          <w:alias w:val="Page title for search"/>
           <w:tag w:val="page.title"/>
+          <w:text w:multiLine="1"/>
         </w:sdtPr>
         <w:sdtContent>
           <w:r>
@@ -181,12 +485,22 @@
       </w:sdt>
     </w:p>
     <w:p>
+      <w:pPr>
+        <w:keepNext/>
+      </w:pPr>
       <w:r>
-        <w:t/>
+        <w:rPr>
+          <w:b/>
+        </w:rPr>
+        <w:t>Hero section ID</w:t>
       </w:r>
+    </w:p>
+    <w:p>
       <w:sdt>
         <w:sdtPr>
+          <w:alias w:val="Hero section ID"/>
           <w:tag w:val="page.hero.id"/>
+          <w:text w:multiLine="1"/>
         </w:sdtPr>
         <w:sdtContent>
           <w:r>
@@ -196,12 +510,22 @@
       </w:sdt>
     </w:p>
     <w:p>
+      <w:pPr>
+        <w:keepNext/>
+      </w:pPr>
       <w:r>
-        <w:t/>
+        <w:rPr>
+          <w:b/>
+        </w:rPr>
+        <w:t>Hero heading</w:t>
       </w:r>
+    </w:p>
+    <w:p>
       <w:sdt>
         <w:sdtPr>
+          <w:alias w:val="Hero heading"/>
           <w:tag w:val="page.hero.heading"/>
+          <w:text w:multiLine="1"/>
         </w:sdtPr>
         <w:sdtContent>
           <w:r>
@@ -211,12 +535,22 @@
       </w:sdt>
     </w:p>
     <w:p>
+      <w:pPr>
+        <w:keepNext/>
+      </w:pPr>
       <w:r>
-        <w:t/>
+        <w:rPr>
+          <w:b/>
+        </w:rPr>
+        <w:t>Hero paragraph</w:t>
       </w:r>
+    </w:p>
+    <w:p>
       <w:sdt>
         <w:sdtPr>
+          <w:alias w:val="Hero paragraph"/>
           <w:tag w:val="page.hero.body"/>
+          <w:text w:multiLine="1"/>
         </w:sdtPr>
         <w:sdtContent>
           <w:r>
@@ -226,12 +560,22 @@
       </w:sdt>
     </w:p>
     <w:p>
+      <w:pPr>
+        <w:keepNext/>
+      </w:pPr>
       <w:r>
-        <w:t/>
+        <w:rPr>
+          <w:b/>
+        </w:rPr>
+        <w:t>Hero button text and destination</w:t>
       </w:r>
+    </w:p>
+    <w:p>
       <w:sdt>
         <w:sdtPr>
+          <w:alias w:val="Hero button text and destination"/>
           <w:tag w:val="page.hero.button"/>
+          <w:text w:multiLine="1"/>
         </w:sdtPr>
         <w:sdtContent>
           <w:r>
@@ -241,17 +585,101 @@
       </w:sdt>
     </w:p>
     <w:p>
+      <w:pPr>
+        <w:keepNext/>
+      </w:pPr>
+      <w:r>
+        <w:rPr>
+          <w:b/>
+        </w:rPr>
+        <w:t>Hero image URL and description</w:t>
+      </w:r>
+    </w:p>
+    <w:p>
+      <w:sdt>
+        <w:sdtPr>
+          <w:alias w:val="Hero image URL and description"/>
+          <w:tag w:val="page.hero.image"/>
+          <w:text w:multiLine="1"/>
+        </w:sdtPr>
+        <w:sdtContent>
+          <w:r>
+            <w:t>https://ramakenkenya.github.io/rea-website-studio/example-photos/living.jpg | A light living room with a sofa and natural wood furniture</w:t>
+          </w:r>
+        </w:sdtContent>
+      </w:sdt>
+    </w:p>
+    <w:p>
+      <w:r>
+        <w:br w:type="page"/>
+      </w:r>
+    </w:p>
+    <w:p>
+      <w:pPr>
+        <w:pStyle w:val="Heading1"/>
+      </w:pPr>
       <w:r>
         <w:t>Page content</w:t>
       </w:r>
     </w:p>
     <w:p>
       <w:r>
-        <w:t/>
+        <w:t>shop</w:t>
       </w:r>
+    </w:p>
+    <w:p>
+      <w:r>
+        <w:drawing>
+          <wp:inline xmlns:a="http://schemas.openxmlformats.org/drawingml/2006/main" xmlns:pic="http://schemas.openxmlformats.org/drawingml/2006/picture">
+            <wp:extent cx="2763506" cy="1841500"/>
+            <wp:docPr id="3" name="Picture 3"/>
+            <wp:cNvGraphicFramePr>
+              <a:graphicFrameLocks noChangeAspect="1"/>
+            </wp:cNvGraphicFramePr>
+            <a:graphic>
+              <a:graphicData uri="http://schemas.openxmlformats.org/drawingml/2006/picture">
+                <pic:pic>
+                  <pic:nvPicPr>
+                    <pic:cNvPr id="0" name="dining.jpg"/>
+                    <pic:cNvPicPr/>
+                  </pic:nvPicPr>
+                  <pic:blipFill>
+                    <a:blip r:embed="rId10"/>
+                    <a:stretch>
+                      <a:fillRect/>
+                    </a:stretch>
+                  </pic:blipFill>
+                  <pic:spPr>
+                    <a:xfrm>
+                      <a:off x="0" y="0"/>
+                      <a:ext cx="2763506" cy="1841500"/>
+                    </a:xfrm>
+                    <a:prstGeom prst="rect"/>
+                  </pic:spPr>
+                </pic:pic>
+              </a:graphicData>
+            </a:graphic>
+          </wp:inline>
+        </w:drawing>
+      </w:r>
+    </w:p>
+    <w:p>
+      <w:pPr>
+        <w:keepNext/>
+      </w:pPr>
+      <w:r>
+        <w:rPr>
+          <w:b/>
+        </w:rPr>
+        <w:t>Page ID</w:t>
+      </w:r>
+    </w:p>
+    <w:p>
       <w:sdt>
         <w:sdtPr>
+          <w:alias w:val="Page ID"/>
           <w:tag w:val="page.id"/>
+          <w:text w:multiLine="1"/>
         </w:sdtPr>
         <w:sdtContent>
           <w:r>
@@ -261,12 +689,22 @@
       </w:sdt>
     </w:p>
     <w:p>
+      <w:pPr>
+        <w:keepNext/>
+      </w:pPr>
       <w:r>
-        <w:t/>
+        <w:rPr>
+          <w:b/>
+        </w:rPr>
+        <w:t>Page title for search</w:t>
       </w:r>
+    </w:p>
+    <w:p>
       <w:sdt>
         <w:sdtPr>
+          <w:alias w:val="Page title for search"/>
           <w:tag w:val="page.title"/>
+          <w:text w:multiLine="1"/>
         </w:sdtPr>
         <w:sdtContent>
           <w:r>
@@ -276,12 +714,22 @@
       </w:sdt>
     </w:p>
     <w:p>
+      <w:pPr>
+        <w:keepNext/>
+      </w:pPr>
       <w:r>
-        <w:t/>
+        <w:rPr>
+          <w:b/>
+        </w:rPr>
+        <w:t>Hero section ID</w:t>
       </w:r>
+    </w:p>
+    <w:p>
       <w:sdt>
         <w:sdtPr>
+          <w:alias w:val="Hero section ID"/>
           <w:tag w:val="page.hero.id"/>
+          <w:text w:multiLine="1"/>
         </w:sdtPr>
         <w:sdtContent>
           <w:r>
@@ -291,12 +739,22 @@
       </w:sdt>
     </w:p>
     <w:p>
+      <w:pPr>
+        <w:keepNext/>
+      </w:pPr>
       <w:r>
-        <w:t/>
+        <w:rPr>
+          <w:b/>
+        </w:rPr>
+        <w:t>Hero heading</w:t>
       </w:r>
+    </w:p>
+    <w:p>
       <w:sdt>
         <w:sdtPr>
+          <w:alias w:val="Hero heading"/>
           <w:tag w:val="page.hero.heading"/>
+          <w:text w:multiLine="1"/>
         </w:sdtPr>
         <w:sdtContent>
           <w:r>
@@ -306,12 +764,22 @@
       </w:sdt>
     </w:p>
     <w:p>
+      <w:pPr>
+        <w:keepNext/>
+      </w:pPr>
       <w:r>
-        <w:t/>
+        <w:rPr>
+          <w:b/>
+        </w:rPr>
+        <w:t>Hero paragraph</w:t>
       </w:r>
+    </w:p>
+    <w:p>
       <w:sdt>
         <w:sdtPr>
+          <w:alias w:val="Hero paragraph"/>
           <w:tag w:val="page.hero.body"/>
+          <w:text w:multiLine="1"/>
         </w:sdtPr>
         <w:sdtContent>
           <w:r>
@@ -321,12 +789,22 @@
       </w:sdt>
     </w:p>
     <w:p>
+      <w:pPr>
+        <w:keepNext/>
+      </w:pPr>
       <w:r>
-        <w:t/>
+        <w:rPr>
+          <w:b/>
+        </w:rPr>
+        <w:t>Hero button text and destination</w:t>
       </w:r>
+    </w:p>
+    <w:p>
       <w:sdt>
         <w:sdtPr>
+          <w:alias w:val="Hero button text and destination"/>
           <w:tag w:val="page.hero.button"/>
+          <w:text w:multiLine="1"/>
         </w:sdtPr>
         <w:sdtContent>
           <w:r>
@@ -336,17 +814,101 @@
       </w:sdt>
     </w:p>
     <w:p>
+      <w:pPr>
+        <w:keepNext/>
+      </w:pPr>
+      <w:r>
+        <w:rPr>
+          <w:b/>
+        </w:rPr>
+        <w:t>Hero image URL and description</w:t>
+      </w:r>
+    </w:p>
+    <w:p>
+      <w:sdt>
+        <w:sdtPr>
+          <w:alias w:val="Hero image URL and description"/>
+          <w:tag w:val="page.hero.image"/>
+          <w:text w:multiLine="1"/>
+        </w:sdtPr>
+        <w:sdtContent>
+          <w:r>
+            <w:t>https://ramakenkenya.github.io/rea-website-studio/example-photos/dining.jpg | A wooden dining table with chairs</w:t>
+          </w:r>
+        </w:sdtContent>
+      </w:sdt>
+    </w:p>
+    <w:p>
+      <w:r>
+        <w:br w:type="page"/>
+      </w:r>
+    </w:p>
+    <w:p>
+      <w:pPr>
+        <w:pStyle w:val="Heading1"/>
+      </w:pPr>
       <w:r>
         <w:t>Page content</w:t>
       </w:r>
     </w:p>
     <w:p>
       <w:r>
-        <w:t/>
+        <w:t>lookbook</w:t>
       </w:r>
+    </w:p>
+    <w:p>
+      <w:r>
+        <w:drawing>
+          <wp:inline xmlns:a="http://schemas.openxmlformats.org/drawingml/2006/main" xmlns:pic="http://schemas.openxmlformats.org/drawingml/2006/picture">
+            <wp:extent cx="2752241" cy="1841499"/>
+            <wp:docPr id="4" name="Picture 4"/>
+            <wp:cNvGraphicFramePr>
+              <a:graphicFrameLocks noChangeAspect="1"/>
+            </wp:cNvGraphicFramePr>
+            <a:graphic>
+              <a:graphicData uri="http://schemas.openxmlformats.org/drawingml/2006/picture">
+                <pic:pic>
+                  <pic:nvPicPr>
+                    <pic:cNvPr id="0" name="original-1.jpg"/>
+                    <pic:cNvPicPr/>
+                  </pic:nvPicPr>
+                  <pic:blipFill>
+                    <a:blip r:embed="rId11"/>
+                    <a:stretch>
+                      <a:fillRect/>
+                    </a:stretch>
+                  </pic:blipFill>
+                  <pic:spPr>
+                    <a:xfrm>
+                      <a:off x="0" y="0"/>
+                      <a:ext cx="2752241" cy="1841499"/>
+                    </a:xfrm>
+                    <a:prstGeom prst="rect"/>
+                  </pic:spPr>
+                </pic:pic>
+              </a:graphicData>
+            </a:graphic>
+          </wp:inline>
+        </w:drawing>
+      </w:r>
+    </w:p>
+    <w:p>
+      <w:pPr>
+        <w:keepNext/>
+      </w:pPr>
+      <w:r>
+        <w:rPr>
+          <w:b/>
+        </w:rPr>
+        <w:t>Page ID</w:t>
+      </w:r>
+    </w:p>
+    <w:p>
       <w:sdt>
         <w:sdtPr>
+          <w:alias w:val="Page ID"/>
           <w:tag w:val="page.id"/>
+          <w:text w:multiLine="1"/>
         </w:sdtPr>
         <w:sdtContent>
           <w:r>
@@ -356,12 +918,22 @@
       </w:sdt>
     </w:p>
     <w:p>
+      <w:pPr>
+        <w:keepNext/>
+      </w:pPr>
       <w:r>
-        <w:t/>
+        <w:rPr>
+          <w:b/>
+        </w:rPr>
+        <w:t>Page title for search</w:t>
       </w:r>
+    </w:p>
+    <w:p>
       <w:sdt>
         <w:sdtPr>
+          <w:alias w:val="Page title for search"/>
           <w:tag w:val="page.title"/>
+          <w:text w:multiLine="1"/>
         </w:sdtPr>
         <w:sdtContent>
           <w:r>
@@ -371,12 +943,22 @@
       </w:sdt>
     </w:p>
     <w:p>
+      <w:pPr>
+        <w:keepNext/>
+      </w:pPr>
       <w:r>
-        <w:t/>
+        <w:rPr>
+          <w:b/>
+        </w:rPr>
+        <w:t>Hero section ID</w:t>
       </w:r>
+    </w:p>
+    <w:p>
       <w:sdt>
         <w:sdtPr>
+          <w:alias w:val="Hero section ID"/>
           <w:tag w:val="page.hero.id"/>
+          <w:text w:multiLine="1"/>
         </w:sdtPr>
         <w:sdtContent>
           <w:r>
@@ -386,12 +968,22 @@
       </w:sdt>
     </w:p>
     <w:p>
+      <w:pPr>
+        <w:keepNext/>
+      </w:pPr>
       <w:r>
-        <w:t/>
+        <w:rPr>
+          <w:b/>
+        </w:rPr>
+        <w:t>Hero heading</w:t>
       </w:r>
+    </w:p>
+    <w:p>
       <w:sdt>
         <w:sdtPr>
+          <w:alias w:val="Hero heading"/>
           <w:tag w:val="page.hero.heading"/>
+          <w:text w:multiLine="1"/>
         </w:sdtPr>
         <w:sdtContent>
           <w:r>
@@ -401,12 +993,22 @@
       </w:sdt>
     </w:p>
     <w:p>
+      <w:pPr>
+        <w:keepNext/>
+      </w:pPr>
       <w:r>
-        <w:t/>
+        <w:rPr>
+          <w:b/>
+        </w:rPr>
+        <w:t>Hero paragraph</w:t>
       </w:r>
+    </w:p>
+    <w:p>
       <w:sdt>
         <w:sdtPr>
+          <w:alias w:val="Hero paragraph"/>
           <w:tag w:val="page.hero.body"/>
+          <w:text w:multiLine="1"/>
         </w:sdtPr>
         <w:sdtContent>
           <w:r>
@@ -416,12 +1018,22 @@
       </w:sdt>
     </w:p>
     <w:p>
+      <w:pPr>
+        <w:keepNext/>
+      </w:pPr>
       <w:r>
-        <w:t/>
+        <w:rPr>
+          <w:b/>
+        </w:rPr>
+        <w:t>Hero button text and destination</w:t>
       </w:r>
+    </w:p>
+    <w:p>
       <w:sdt>
         <w:sdtPr>
+          <w:alias w:val="Hero button text and destination"/>
           <w:tag w:val="page.hero.button"/>
+          <w:text w:multiLine="1"/>
         </w:sdtPr>
         <w:sdtContent>
           <w:r>
@@ -431,17 +1043,101 @@
       </w:sdt>
     </w:p>
     <w:p>
+      <w:pPr>
+        <w:keepNext/>
+      </w:pPr>
+      <w:r>
+        <w:rPr>
+          <w:b/>
+        </w:rPr>
+        <w:t>Hero image URL and description</w:t>
+      </w:r>
+    </w:p>
+    <w:p>
+      <w:sdt>
+        <w:sdtPr>
+          <w:alias w:val="Hero image URL and description"/>
+          <w:tag w:val="page.hero.image"/>
+          <w:text w:multiLine="1"/>
+        </w:sdtPr>
+        <w:sdtContent>
+          <w:r>
+            <w:t>https://ramakenkenya.github.io/rea-website-studio/example-photos/original-1.jpg | An eclectic living room photographed by Carlos ZGZ</w:t>
+          </w:r>
+        </w:sdtContent>
+      </w:sdt>
+    </w:p>
+    <w:p>
+      <w:r>
+        <w:br w:type="page"/>
+      </w:r>
+    </w:p>
+    <w:p>
+      <w:pPr>
+        <w:pStyle w:val="Heading1"/>
+      </w:pPr>
       <w:r>
         <w:t>Page content</w:t>
       </w:r>
     </w:p>
     <w:p>
       <w:r>
-        <w:t/>
+        <w:t>about</w:t>
       </w:r>
+    </w:p>
+    <w:p>
+      <w:r>
+        <w:drawing>
+          <wp:inline xmlns:a="http://schemas.openxmlformats.org/drawingml/2006/main" xmlns:pic="http://schemas.openxmlformats.org/drawingml/2006/picture">
+            <wp:extent cx="2455333" cy="1841500"/>
+            <wp:docPr id="5" name="Picture 5"/>
+            <wp:cNvGraphicFramePr>
+              <a:graphicFrameLocks noChangeAspect="1"/>
+            </wp:cNvGraphicFramePr>
+            <a:graphic>
+              <a:graphicData uri="http://schemas.openxmlformats.org/drawingml/2006/picture">
+                <pic:pic>
+                  <pic:nvPicPr>
+                    <pic:cNvPr id="0" name="original-2.jpg"/>
+                    <pic:cNvPicPr/>
+                  </pic:nvPicPr>
+                  <pic:blipFill>
+                    <a:blip r:embed="rId12"/>
+                    <a:stretch>
+                      <a:fillRect/>
+                    </a:stretch>
+                  </pic:blipFill>
+                  <pic:spPr>
+                    <a:xfrm>
+                      <a:off x="0" y="0"/>
+                      <a:ext cx="2455333" cy="1841500"/>
+                    </a:xfrm>
+                    <a:prstGeom prst="rect"/>
+                  </pic:spPr>
+                </pic:pic>
+              </a:graphicData>
+            </a:graphic>
+          </wp:inline>
+        </w:drawing>
+      </w:r>
+    </w:p>
+    <w:p>
+      <w:pPr>
+        <w:keepNext/>
+      </w:pPr>
+      <w:r>
+        <w:rPr>
+          <w:b/>
+        </w:rPr>
+        <w:t>Page ID</w:t>
+      </w:r>
+    </w:p>
+    <w:p>
       <w:sdt>
         <w:sdtPr>
+          <w:alias w:val="Page ID"/>
           <w:tag w:val="page.id"/>
+          <w:text w:multiLine="1"/>
         </w:sdtPr>
         <w:sdtContent>
           <w:r>
@@ -451,12 +1147,22 @@
       </w:sdt>
     </w:p>
     <w:p>
+      <w:pPr>
+        <w:keepNext/>
+      </w:pPr>
       <w:r>
-        <w:t/>
+        <w:rPr>
+          <w:b/>
+        </w:rPr>
+        <w:t>Page title for search</w:t>
       </w:r>
+    </w:p>
+    <w:p>
       <w:sdt>
         <w:sdtPr>
+          <w:alias w:val="Page title for search"/>
           <w:tag w:val="page.title"/>
+          <w:text w:multiLine="1"/>
         </w:sdtPr>
         <w:sdtContent>
           <w:r>
@@ -466,12 +1172,22 @@
       </w:sdt>
     </w:p>
     <w:p>
+      <w:pPr>
+        <w:keepNext/>
+      </w:pPr>
       <w:r>
-        <w:t/>
+        <w:rPr>
+          <w:b/>
+        </w:rPr>
+        <w:t>Hero section ID</w:t>
       </w:r>
+    </w:p>
+    <w:p>
       <w:sdt>
         <w:sdtPr>
+          <w:alias w:val="Hero section ID"/>
           <w:tag w:val="page.hero.id"/>
+          <w:text w:multiLine="1"/>
         </w:sdtPr>
         <w:sdtContent>
           <w:r>
@@ -481,12 +1197,22 @@
       </w:sdt>
     </w:p>
     <w:p>
+      <w:pPr>
+        <w:keepNext/>
+      </w:pPr>
       <w:r>
-        <w:t/>
+        <w:rPr>
+          <w:b/>
+        </w:rPr>
+        <w:t>Hero heading</w:t>
       </w:r>
+    </w:p>
+    <w:p>
       <w:sdt>
         <w:sdtPr>
+          <w:alias w:val="Hero heading"/>
           <w:tag w:val="page.hero.heading"/>
+          <w:text w:multiLine="1"/>
         </w:sdtPr>
         <w:sdtContent>
           <w:r>
@@ -496,12 +1222,22 @@
       </w:sdt>
     </w:p>
     <w:p>
+      <w:pPr>
+        <w:keepNext/>
+      </w:pPr>
       <w:r>
-        <w:t/>
+        <w:rPr>
+          <w:b/>
+        </w:rPr>
+        <w:t>Hero paragraph</w:t>
       </w:r>
+    </w:p>
+    <w:p>
       <w:sdt>
         <w:sdtPr>
+          <w:alias w:val="Hero paragraph"/>
           <w:tag w:val="page.hero.body"/>
+          <w:text w:multiLine="1"/>
         </w:sdtPr>
         <w:sdtContent>
           <w:r>
@@ -511,12 +1247,22 @@
       </w:sdt>
     </w:p>
     <w:p>
+      <w:pPr>
+        <w:keepNext/>
+      </w:pPr>
       <w:r>
-        <w:t/>
+        <w:rPr>
+          <w:b/>
+        </w:rPr>
+        <w:t>Hero button text and destination</w:t>
       </w:r>
+    </w:p>
+    <w:p>
       <w:sdt>
         <w:sdtPr>
+          <w:alias w:val="Hero button text and destination"/>
           <w:tag w:val="page.hero.button"/>
+          <w:text w:multiLine="1"/>
         </w:sdtPr>
         <w:sdtContent>
           <w:r>
@@ -526,17 +1272,65 @@
       </w:sdt>
     </w:p>
     <w:p>
+      <w:pPr>
+        <w:keepNext/>
+      </w:pPr>
+      <w:r>
+        <w:rPr>
+          <w:b/>
+        </w:rPr>
+        <w:t>Hero image URL and description</w:t>
+      </w:r>
+    </w:p>
+    <w:p>
+      <w:sdt>
+        <w:sdtPr>
+          <w:alias w:val="Hero image URL and description"/>
+          <w:tag w:val="page.hero.image"/>
+          <w:text w:multiLine="1"/>
+        </w:sdtPr>
+        <w:sdtContent>
+          <w:r>
+            <w:t>https://ramakenkenya.github.io/rea-website-studio/example-photos/original-2.jpg | A furnished living room with shelves and seating</w:t>
+          </w:r>
+        </w:sdtContent>
+      </w:sdt>
+    </w:p>
+    <w:p>
+      <w:r>
+        <w:br w:type="page"/>
+      </w:r>
+    </w:p>
+    <w:p>
+      <w:pPr>
+        <w:pStyle w:val="Heading1"/>
+      </w:pPr>
       <w:r>
         <w:t>Section content</w:t>
       </w:r>
     </w:p>
     <w:p>
       <w:r>
-        <w:t/>
+        <w:t>catalogue</w:t>
       </w:r>
+    </w:p>
+    <w:p>
+      <w:pPr>
+        <w:keepNext/>
+      </w:pPr>
+      <w:r>
+        <w:rPr>
+          <w:b/>
+        </w:rPr>
+        <w:t>Page ID</w:t>
+      </w:r>
+    </w:p>
+    <w:p>
       <w:sdt>
         <w:sdtPr>
+          <w:alias w:val="Page ID"/>
           <w:tag w:val="section.page"/>
+          <w:text w:multiLine="1"/>
         </w:sdtPr>
         <w:sdtContent>
           <w:r>
@@ -546,12 +1340,22 @@
       </w:sdt>
     </w:p>
     <w:p>
+      <w:pPr>
+        <w:keepNext/>
+      </w:pPr>
       <w:r>
-        <w:t/>
+        <w:rPr>
+          <w:b/>
+        </w:rPr>
+        <w:t>Section ID</w:t>
       </w:r>
+    </w:p>
+    <w:p>
       <w:sdt>
         <w:sdtPr>
+          <w:alias w:val="Section ID"/>
           <w:tag w:val="section.id"/>
+          <w:text w:multiLine="1"/>
         </w:sdtPr>
         <w:sdtContent>
           <w:r>
@@ -561,12 +1365,22 @@
       </w:sdt>
     </w:p>
     <w:p>
+      <w:pPr>
+        <w:keepNext/>
+      </w:pPr>
       <w:r>
-        <w:t/>
+        <w:rPr>
+          <w:b/>
+        </w:rPr>
+        <w:t>Section type</w:t>
       </w:r>
+    </w:p>
+    <w:p>
       <w:sdt>
         <w:sdtPr>
+          <w:alias w:val="Section type"/>
           <w:tag w:val="section.type"/>
+          <w:text w:multiLine="1"/>
         </w:sdtPr>
         <w:sdtContent>
           <w:r>
@@ -576,12 +1390,22 @@
       </w:sdt>
     </w:p>
     <w:p>
+      <w:pPr>
+        <w:keepNext/>
+      </w:pPr>
       <w:r>
-        <w:t/>
+        <w:rPr>
+          <w:b/>
+        </w:rPr>
+        <w:t>Section heading</w:t>
       </w:r>
+    </w:p>
+    <w:p>
       <w:sdt>
         <w:sdtPr>
+          <w:alias w:val="Section heading"/>
           <w:tag w:val="section.heading"/>
+          <w:text w:multiLine="1"/>
         </w:sdtPr>
         <w:sdtContent>
           <w:r>
@@ -592,16 +1416,39 @@
     </w:p>
     <w:p>
       <w:r>
+        <w:br w:type="page"/>
+      </w:r>
+    </w:p>
+    <w:p>
+      <w:pPr>
+        <w:pStyle w:val="Heading1"/>
+      </w:pPr>
+      <w:r>
         <w:t>Section content</w:t>
       </w:r>
     </w:p>
     <w:p>
       <w:r>
-        <w:t/>
+        <w:t>rooms</w:t>
       </w:r>
+    </w:p>
+    <w:p>
+      <w:pPr>
+        <w:keepNext/>
+      </w:pPr>
+      <w:r>
+        <w:rPr>
+          <w:b/>
+        </w:rPr>
+        <w:t>Page ID</w:t>
+      </w:r>
+    </w:p>
+    <w:p>
       <w:sdt>
         <w:sdtPr>
+          <w:alias w:val="Page ID"/>
           <w:tag w:val="section.page"/>
+          <w:text w:multiLine="1"/>
         </w:sdtPr>
         <w:sdtContent>
           <w:r>
@@ -611,12 +1458,22 @@
       </w:sdt>
     </w:p>
     <w:p>
+      <w:pPr>
+        <w:keepNext/>
+      </w:pPr>
       <w:r>
-        <w:t/>
+        <w:rPr>
+          <w:b/>
+        </w:rPr>
+        <w:t>Section ID</w:t>
       </w:r>
+    </w:p>
+    <w:p>
       <w:sdt>
         <w:sdtPr>
+          <w:alias w:val="Section ID"/>
           <w:tag w:val="section.id"/>
+          <w:text w:multiLine="1"/>
         </w:sdtPr>
         <w:sdtContent>
           <w:r>
@@ -626,12 +1483,22 @@
       </w:sdt>
     </w:p>
     <w:p>
+      <w:pPr>
+        <w:keepNext/>
+      </w:pPr>
       <w:r>
-        <w:t/>
+        <w:rPr>
+          <w:b/>
+        </w:rPr>
+        <w:t>Section type</w:t>
       </w:r>
+    </w:p>
+    <w:p>
       <w:sdt>
         <w:sdtPr>
+          <w:alias w:val="Section type"/>
           <w:tag w:val="section.type"/>
+          <w:text w:multiLine="1"/>
         </w:sdtPr>
         <w:sdtContent>
           <w:r>
@@ -641,12 +1508,22 @@
       </w:sdt>
     </w:p>
     <w:p>
+      <w:pPr>
+        <w:keepNext/>
+      </w:pPr>
       <w:r>
-        <w:t/>
+        <w:rPr>
+          <w:b/>
+        </w:rPr>
+        <w:t>Section heading</w:t>
       </w:r>
+    </w:p>
+    <w:p>
       <w:sdt>
         <w:sdtPr>
+          <w:alias w:val="Section heading"/>
           <w:tag w:val="section.heading"/>
+          <w:text w:multiLine="1"/>
         </w:sdtPr>
         <w:sdtContent>
           <w:r>
@@ -657,16 +1534,39 @@
     </w:p>
     <w:p>
       <w:r>
+        <w:br w:type="page"/>
+      </w:r>
+    </w:p>
+    <w:p>
+      <w:pPr>
+        <w:pStyle w:val="Heading1"/>
+      </w:pPr>
+      <w:r>
         <w:t>Section content</w:t>
       </w:r>
     </w:p>
     <w:p>
       <w:r>
-        <w:t/>
+        <w:t>help</w:t>
       </w:r>
+    </w:p>
+    <w:p>
+      <w:pPr>
+        <w:keepNext/>
+      </w:pPr>
+      <w:r>
+        <w:rPr>
+          <w:b/>
+        </w:rPr>
+        <w:t>Page ID</w:t>
+      </w:r>
+    </w:p>
+    <w:p>
       <w:sdt>
         <w:sdtPr>
+          <w:alias w:val="Page ID"/>
           <w:tag w:val="section.page"/>
+          <w:text w:multiLine="1"/>
         </w:sdtPr>
         <w:sdtContent>
           <w:r>
@@ -676,12 +1576,22 @@
       </w:sdt>
     </w:p>
     <w:p>
+      <w:pPr>
+        <w:keepNext/>
+      </w:pPr>
       <w:r>
-        <w:t/>
+        <w:rPr>
+          <w:b/>
+        </w:rPr>
+        <w:t>Section ID</w:t>
       </w:r>
+    </w:p>
+    <w:p>
       <w:sdt>
         <w:sdtPr>
+          <w:alias w:val="Section ID"/>
           <w:tag w:val="section.id"/>
+          <w:text w:multiLine="1"/>
         </w:sdtPr>
         <w:sdtContent>
           <w:r>
@@ -691,12 +1601,22 @@
       </w:sdt>
     </w:p>
     <w:p>
+      <w:pPr>
+        <w:keepNext/>
+      </w:pPr>
       <w:r>
-        <w:t/>
+        <w:rPr>
+          <w:b/>
+        </w:rPr>
+        <w:t>Section type</w:t>
       </w:r>
+    </w:p>
+    <w:p>
       <w:sdt>
         <w:sdtPr>
+          <w:alias w:val="Section type"/>
           <w:tag w:val="section.type"/>
+          <w:text w:multiLine="1"/>
         </w:sdtPr>
         <w:sdtContent>
           <w:r>
@@ -706,12 +1626,22 @@
       </w:sdt>
     </w:p>
     <w:p>
+      <w:pPr>
+        <w:keepNext/>
+      </w:pPr>
       <w:r>
-        <w:t/>
+        <w:rPr>
+          <w:b/>
+        </w:rPr>
+        <w:t>Section heading</w:t>
       </w:r>
+    </w:p>
+    <w:p>
       <w:sdt>
         <w:sdtPr>
+          <w:alias w:val="Section heading"/>
           <w:tag w:val="section.heading"/>
+          <w:text w:multiLine="1"/>
         </w:sdtPr>
         <w:sdtContent>
           <w:r>
@@ -722,16 +1652,39 @@
     </w:p>
     <w:p>
       <w:r>
+        <w:br w:type="page"/>
+      </w:r>
+    </w:p>
+    <w:p>
+      <w:pPr>
+        <w:pStyle w:val="Heading1"/>
+      </w:pPr>
+      <w:r>
         <w:t>Section content</w:t>
       </w:r>
     </w:p>
     <w:p>
       <w:r>
-        <w:t/>
+        <w:t>values</w:t>
       </w:r>
+    </w:p>
+    <w:p>
+      <w:pPr>
+        <w:keepNext/>
+      </w:pPr>
+      <w:r>
+        <w:rPr>
+          <w:b/>
+        </w:rPr>
+        <w:t>Page ID</w:t>
+      </w:r>
+    </w:p>
+    <w:p>
       <w:sdt>
         <w:sdtPr>
+          <w:alias w:val="Page ID"/>
           <w:tag w:val="section.page"/>
+          <w:text w:multiLine="1"/>
         </w:sdtPr>
         <w:sdtContent>
           <w:r>
@@ -741,12 +1694,22 @@
       </w:sdt>
     </w:p>
     <w:p>
+      <w:pPr>
+        <w:keepNext/>
+      </w:pPr>
       <w:r>
-        <w:t/>
+        <w:rPr>
+          <w:b/>
+        </w:rPr>
+        <w:t>Section ID</w:t>
       </w:r>
+    </w:p>
+    <w:p>
       <w:sdt>
         <w:sdtPr>
+          <w:alias w:val="Section ID"/>
           <w:tag w:val="section.id"/>
+          <w:text w:multiLine="1"/>
         </w:sdtPr>
         <w:sdtContent>
           <w:r>
@@ -756,12 +1719,22 @@
       </w:sdt>
     </w:p>
     <w:p>
+      <w:pPr>
+        <w:keepNext/>
+      </w:pPr>
       <w:r>
-        <w:t/>
+        <w:rPr>
+          <w:b/>
+        </w:rPr>
+        <w:t>Section type</w:t>
       </w:r>
+    </w:p>
+    <w:p>
       <w:sdt>
         <w:sdtPr>
+          <w:alias w:val="Section type"/>
           <w:tag w:val="section.type"/>
+          <w:text w:multiLine="1"/>
         </w:sdtPr>
         <w:sdtContent>
           <w:r>
@@ -771,12 +1744,22 @@
       </w:sdt>
     </w:p>
     <w:p>
+      <w:pPr>
+        <w:keepNext/>
+      </w:pPr>
       <w:r>
-        <w:t/>
+        <w:rPr>
+          <w:b/>
+        </w:rPr>
+        <w:t>Section heading</w:t>
       </w:r>
+    </w:p>
+    <w:p>
       <w:sdt>
         <w:sdtPr>
+          <w:alias w:val="Section heading"/>
           <w:tag w:val="section.heading"/>
+          <w:text w:multiLine="1"/>
         </w:sdtPr>
         <w:sdtContent>
           <w:r>
@@ -786,33 +1769,105 @@
       </w:sdt>
     </w:p>
     <w:p>
+      <w:pPr>
+        <w:keepNext/>
+      </w:pPr>
       <w:r>
-        <w:t/>
+        <w:rPr>
+          <w:b/>
+        </w:rPr>
+        <w:t>Cards or repeated items</w:t>
       </w:r>
+    </w:p>
+    <w:p>
       <w:sdt>
         <w:sdtPr>
+          <w:alias w:val="Cards or repeated items"/>
           <w:tag w:val="section.items"/>
+          <w:text w:multiLine="1"/>
         </w:sdtPr>
         <w:sdtContent>
           <w:r>
-            <w:t>Comfort | A place to settle in.
-Practicality | Room for everyday life.</w:t>
+            <w:t>Comfort | A place to settle in.</w:t>
+          </w:r>
+          <w:r>
+            <w:br/>
+            <w:t>Practicality | Room for everyday life.</w:t>
           </w:r>
         </w:sdtContent>
       </w:sdt>
     </w:p>
     <w:p>
       <w:r>
+        <w:br w:type="page"/>
+      </w:r>
+    </w:p>
+    <w:p>
+      <w:pPr>
+        <w:pStyle w:val="Heading1"/>
+      </w:pPr>
+      <w:r>
         <w:t>Product record</w:t>
       </w:r>
     </w:p>
     <w:p>
       <w:r>
-        <w:t/>
+        <w:t>Nia Sofa</w:t>
       </w:r>
+    </w:p>
+    <w:p>
+      <w:r>
+        <w:drawing>
+          <wp:inline xmlns:a="http://schemas.openxmlformats.org/drawingml/2006/main" xmlns:pic="http://schemas.openxmlformats.org/drawingml/2006/picture">
+            <wp:extent cx="2763506" cy="1841500"/>
+            <wp:docPr id="6" name="Picture 6"/>
+            <wp:cNvGraphicFramePr>
+              <a:graphicFrameLocks noChangeAspect="1"/>
+            </wp:cNvGraphicFramePr>
+            <a:graphic>
+              <a:graphicData uri="http://schemas.openxmlformats.org/drawingml/2006/picture">
+                <pic:pic>
+                  <pic:nvPicPr>
+                    <pic:cNvPr id="0" name="sofa.jpg"/>
+                    <pic:cNvPicPr/>
+                  </pic:nvPicPr>
+                  <pic:blipFill>
+                    <a:blip r:embed="rId13"/>
+                    <a:stretch>
+                      <a:fillRect/>
+                    </a:stretch>
+                  </pic:blipFill>
+                  <pic:spPr>
+                    <a:xfrm>
+                      <a:off x="0" y="0"/>
+                      <a:ext cx="2763506" cy="1841500"/>
+                    </a:xfrm>
+                    <a:prstGeom prst="rect"/>
+                  </pic:spPr>
+                </pic:pic>
+              </a:graphicData>
+            </a:graphic>
+          </wp:inline>
+        </w:drawing>
+      </w:r>
+    </w:p>
+    <w:p>
+      <w:pPr>
+        <w:keepNext/>
+      </w:pPr>
+      <w:r>
+        <w:rPr>
+          <w:b/>
+        </w:rPr>
+        <w:t>Shop page ID</w:t>
+      </w:r>
+    </w:p>
+    <w:p>
       <w:sdt>
         <w:sdtPr>
+          <w:alias w:val="Shop page ID"/>
           <w:tag w:val="product.page"/>
+          <w:text w:multiLine="1"/>
         </w:sdtPr>
         <w:sdtContent>
           <w:r>
@@ -822,12 +1877,22 @@
       </w:sdt>
     </w:p>
     <w:p>
+      <w:pPr>
+        <w:keepNext/>
+      </w:pPr>
       <w:r>
-        <w:t/>
+        <w:rPr>
+          <w:b/>
+        </w:rPr>
+        <w:t>Product code</w:t>
       </w:r>
+    </w:p>
+    <w:p>
       <w:sdt>
         <w:sdtPr>
+          <w:alias w:val="Product code"/>
           <w:tag w:val="product.code"/>
+          <w:text w:multiLine="1"/>
         </w:sdtPr>
         <w:sdtContent>
           <w:r>
@@ -837,12 +1902,22 @@
       </w:sdt>
     </w:p>
     <w:p>
+      <w:pPr>
+        <w:keepNext/>
+      </w:pPr>
       <w:r>
-        <w:t/>
+        <w:rPr>
+          <w:b/>
+        </w:rPr>
+        <w:t>Product name</w:t>
       </w:r>
+    </w:p>
+    <w:p>
       <w:sdt>
         <w:sdtPr>
+          <w:alias w:val="Product name"/>
           <w:tag w:val="product.name"/>
+          <w:text w:multiLine="1"/>
         </w:sdtPr>
         <w:sdtContent>
           <w:r>
@@ -852,12 +1927,22 @@
       </w:sdt>
     </w:p>
     <w:p>
+      <w:pPr>
+        <w:keepNext/>
+      </w:pPr>
       <w:r>
-        <w:t/>
+        <w:rPr>
+          <w:b/>
+        </w:rPr>
+        <w:t>Price and currency</w:t>
       </w:r>
+    </w:p>
+    <w:p>
       <w:sdt>
         <w:sdtPr>
+          <w:alias w:val="Price and currency"/>
           <w:tag w:val="product.price"/>
+          <w:text w:multiLine="1"/>
         </w:sdtPr>
         <w:sdtContent>
           <w:r>
@@ -867,42 +1952,72 @@
       </w:sdt>
     </w:p>
     <w:p>
+      <w:pPr>
+        <w:keepNext/>
+      </w:pPr>
       <w:r>
-        <w:t/>
+        <w:rPr>
+          <w:b/>
+        </w:rPr>
+        <w:t>Product description</w:t>
       </w:r>
+    </w:p>
+    <w:p>
       <w:sdt>
         <w:sdtPr>
+          <w:alias w:val="Product description"/>
           <w:tag w:val="product.description"/>
+          <w:text w:multiLine="1"/>
         </w:sdtPr>
         <w:sdtContent>
           <w:r>
-            <w:t>Illustrative furniture for your home.</w:t>
+            <w:t>A soft place to land at the end of the day. Room inspiration photo; example product only.</w:t>
           </w:r>
         </w:sdtContent>
       </w:sdt>
     </w:p>
     <w:p>
+      <w:pPr>
+        <w:keepNext/>
+      </w:pPr>
       <w:r>
-        <w:t/>
+        <w:rPr>
+          <w:b/>
+        </w:rPr>
+        <w:t>Category</w:t>
       </w:r>
+    </w:p>
+    <w:p>
       <w:sdt>
         <w:sdtPr>
+          <w:alias w:val="Category"/>
           <w:tag w:val="product.category"/>
+          <w:text w:multiLine="1"/>
         </w:sdtPr>
         <w:sdtContent>
           <w:r>
-            <w:t>Furniture</w:t>
+            <w:t>Living room</w:t>
           </w:r>
         </w:sdtContent>
       </w:sdt>
     </w:p>
     <w:p>
+      <w:pPr>
+        <w:keepNext/>
+      </w:pPr>
       <w:r>
-        <w:t/>
+        <w:rPr>
+          <w:b/>
+        </w:rPr>
+        <w:t>Size and colour options</w:t>
       </w:r>
+    </w:p>
+    <w:p>
       <w:sdt>
         <w:sdtPr>
+          <w:alias w:val="Size and colour options"/>
           <w:tag w:val="product.options"/>
+          <w:text w:multiLine="1"/>
         </w:sdtPr>
         <w:sdtContent>
           <w:r>
@@ -912,12 +2027,22 @@
       </w:sdt>
     </w:p>
     <w:p>
+      <w:pPr>
+        <w:keepNext/>
+      </w:pPr>
       <w:r>
-        <w:t/>
+        <w:rPr>
+          <w:b/>
+        </w:rPr>
+        <w:t>Availability</w:t>
       </w:r>
+    </w:p>
+    <w:p>
       <w:sdt>
         <w:sdtPr>
+          <w:alias w:val="Availability"/>
           <w:tag w:val="product.available"/>
+          <w:text w:multiLine="1"/>
         </w:sdtPr>
         <w:sdtContent>
           <w:r>
@@ -927,17 +2052,101 @@
       </w:sdt>
     </w:p>
     <w:p>
+      <w:pPr>
+        <w:keepNext/>
+      </w:pPr>
+      <w:r>
+        <w:rPr>
+          <w:b/>
+        </w:rPr>
+        <w:t>Product image URL and description</w:t>
+      </w:r>
+    </w:p>
+    <w:p>
+      <w:sdt>
+        <w:sdtPr>
+          <w:alias w:val="Product image URL and description"/>
+          <w:tag w:val="product.image"/>
+          <w:text w:multiLine="1"/>
+        </w:sdtPr>
+        <w:sdtContent>
+          <w:r>
+            <w:t>https://ramakenkenya.github.io/rea-website-studio/example-photos/sofa.jpg | A comfortable sofa in a bright furnished room</w:t>
+          </w:r>
+        </w:sdtContent>
+      </w:sdt>
+    </w:p>
+    <w:p>
+      <w:r>
+        <w:br w:type="page"/>
+      </w:r>
+    </w:p>
+    <w:p>
+      <w:pPr>
+        <w:pStyle w:val="Heading1"/>
+      </w:pPr>
       <w:r>
         <w:t>Product record</w:t>
       </w:r>
     </w:p>
     <w:p>
       <w:r>
-        <w:t/>
+        <w:t>Pamoja Dining Table</w:t>
       </w:r>
+    </w:p>
+    <w:p>
+      <w:r>
+        <w:drawing>
+          <wp:inline xmlns:a="http://schemas.openxmlformats.org/drawingml/2006/main" xmlns:pic="http://schemas.openxmlformats.org/drawingml/2006/picture">
+            <wp:extent cx="2763506" cy="1841500"/>
+            <wp:docPr id="7" name="Picture 7"/>
+            <wp:cNvGraphicFramePr>
+              <a:graphicFrameLocks noChangeAspect="1"/>
+            </wp:cNvGraphicFramePr>
+            <a:graphic>
+              <a:graphicData uri="http://schemas.openxmlformats.org/drawingml/2006/picture">
+                <pic:pic>
+                  <pic:nvPicPr>
+                    <pic:cNvPr id="0" name="dining.jpg"/>
+                    <pic:cNvPicPr/>
+                  </pic:nvPicPr>
+                  <pic:blipFill>
+                    <a:blip r:embed="rId10"/>
+                    <a:stretch>
+                      <a:fillRect/>
+                    </a:stretch>
+                  </pic:blipFill>
+                  <pic:spPr>
+                    <a:xfrm>
+                      <a:off x="0" y="0"/>
+                      <a:ext cx="2763506" cy="1841500"/>
+                    </a:xfrm>
+                    <a:prstGeom prst="rect"/>
+                  </pic:spPr>
+                </pic:pic>
+              </a:graphicData>
+            </a:graphic>
+          </wp:inline>
+        </w:drawing>
+      </w:r>
+    </w:p>
+    <w:p>
+      <w:pPr>
+        <w:keepNext/>
+      </w:pPr>
+      <w:r>
+        <w:rPr>
+          <w:b/>
+        </w:rPr>
+        <w:t>Shop page ID</w:t>
+      </w:r>
+    </w:p>
+    <w:p>
       <w:sdt>
         <w:sdtPr>
+          <w:alias w:val="Shop page ID"/>
           <w:tag w:val="product.page"/>
+          <w:text w:multiLine="1"/>
         </w:sdtPr>
         <w:sdtContent>
           <w:r>
@@ -947,12 +2156,22 @@
       </w:sdt>
     </w:p>
     <w:p>
+      <w:pPr>
+        <w:keepNext/>
+      </w:pPr>
       <w:r>
-        <w:t/>
+        <w:rPr>
+          <w:b/>
+        </w:rPr>
+        <w:t>Product code</w:t>
       </w:r>
+    </w:p>
+    <w:p>
       <w:sdt>
         <w:sdtPr>
+          <w:alias w:val="Product code"/>
           <w:tag w:val="product.code"/>
+          <w:text w:multiLine="1"/>
         </w:sdtPr>
         <w:sdtContent>
           <w:r>
@@ -962,12 +2181,22 @@
       </w:sdt>
     </w:p>
     <w:p>
+      <w:pPr>
+        <w:keepNext/>
+      </w:pPr>
       <w:r>
-        <w:t/>
+        <w:rPr>
+          <w:b/>
+        </w:rPr>
+        <w:t>Product name</w:t>
       </w:r>
+    </w:p>
+    <w:p>
       <w:sdt>
         <w:sdtPr>
+          <w:alias w:val="Product name"/>
           <w:tag w:val="product.name"/>
+          <w:text w:multiLine="1"/>
         </w:sdtPr>
         <w:sdtContent>
           <w:r>
@@ -977,12 +2206,22 @@
       </w:sdt>
     </w:p>
     <w:p>
+      <w:pPr>
+        <w:keepNext/>
+      </w:pPr>
       <w:r>
-        <w:t/>
+        <w:rPr>
+          <w:b/>
+        </w:rPr>
+        <w:t>Price and currency</w:t>
       </w:r>
+    </w:p>
+    <w:p>
       <w:sdt>
         <w:sdtPr>
+          <w:alias w:val="Price and currency"/>
           <w:tag w:val="product.price"/>
+          <w:text w:multiLine="1"/>
         </w:sdtPr>
         <w:sdtContent>
           <w:r>
@@ -992,42 +2231,72 @@
       </w:sdt>
     </w:p>
     <w:p>
+      <w:pPr>
+        <w:keepNext/>
+      </w:pPr>
       <w:r>
-        <w:t/>
+        <w:rPr>
+          <w:b/>
+        </w:rPr>
+        <w:t>Product description</w:t>
       </w:r>
+    </w:p>
+    <w:p>
       <w:sdt>
         <w:sdtPr>
+          <w:alias w:val="Product description"/>
           <w:tag w:val="product.description"/>
+          <w:text w:multiLine="1"/>
         </w:sdtPr>
         <w:sdtContent>
           <w:r>
-            <w:t>Illustrative furniture for your home.</w:t>
+            <w:t>Gather for everyday meals and conversations. Room inspiration photo; example product only.</w:t>
           </w:r>
         </w:sdtContent>
       </w:sdt>
     </w:p>
     <w:p>
+      <w:pPr>
+        <w:keepNext/>
+      </w:pPr>
       <w:r>
-        <w:t/>
+        <w:rPr>
+          <w:b/>
+        </w:rPr>
+        <w:t>Category</w:t>
       </w:r>
+    </w:p>
+    <w:p>
       <w:sdt>
         <w:sdtPr>
+          <w:alias w:val="Category"/>
           <w:tag w:val="product.category"/>
+          <w:text w:multiLine="1"/>
         </w:sdtPr>
         <w:sdtContent>
           <w:r>
-            <w:t>Furniture</w:t>
+            <w:t>Dining</w:t>
           </w:r>
         </w:sdtContent>
       </w:sdt>
     </w:p>
     <w:p>
+      <w:pPr>
+        <w:keepNext/>
+      </w:pPr>
       <w:r>
-        <w:t/>
+        <w:rPr>
+          <w:b/>
+        </w:rPr>
+        <w:t>Size and colour options</w:t>
       </w:r>
+    </w:p>
+    <w:p>
       <w:sdt>
         <w:sdtPr>
+          <w:alias w:val="Size and colour options"/>
           <w:tag w:val="product.options"/>
+          <w:text w:multiLine="1"/>
         </w:sdtPr>
         <w:sdtContent>
           <w:r>
@@ -1037,12 +2306,22 @@
       </w:sdt>
     </w:p>
     <w:p>
+      <w:pPr>
+        <w:keepNext/>
+      </w:pPr>
       <w:r>
-        <w:t/>
+        <w:rPr>
+          <w:b/>
+        </w:rPr>
+        <w:t>Availability</w:t>
       </w:r>
+    </w:p>
+    <w:p>
       <w:sdt>
         <w:sdtPr>
+          <w:alias w:val="Availability"/>
           <w:tag w:val="product.available"/>
+          <w:text w:multiLine="1"/>
         </w:sdtPr>
         <w:sdtContent>
           <w:r>
@@ -1052,17 +2331,101 @@
       </w:sdt>
     </w:p>
     <w:p>
+      <w:pPr>
+        <w:keepNext/>
+      </w:pPr>
+      <w:r>
+        <w:rPr>
+          <w:b/>
+        </w:rPr>
+        <w:t>Product image URL and description</w:t>
+      </w:r>
+    </w:p>
+    <w:p>
+      <w:sdt>
+        <w:sdtPr>
+          <w:alias w:val="Product image URL and description"/>
+          <w:tag w:val="product.image"/>
+          <w:text w:multiLine="1"/>
+        </w:sdtPr>
+        <w:sdtContent>
+          <w:r>
+            <w:t>https://ramakenkenya.github.io/rea-website-studio/example-photos/dining.jpg | A wooden dining table with chairs</w:t>
+          </w:r>
+        </w:sdtContent>
+      </w:sdt>
+    </w:p>
+    <w:p>
+      <w:r>
+        <w:br w:type="page"/>
+      </w:r>
+    </w:p>
+    <w:p>
+      <w:pPr>
+        <w:pStyle w:val="Heading1"/>
+      </w:pPr>
       <w:r>
         <w:t>Product record</w:t>
       </w:r>
     </w:p>
     <w:p>
       <w:r>
-        <w:t/>
+        <w:t>Kazi Office Desk</w:t>
       </w:r>
+    </w:p>
+    <w:p>
+      <w:r>
+        <w:drawing>
+          <wp:inline xmlns:a="http://schemas.openxmlformats.org/drawingml/2006/main" xmlns:pic="http://schemas.openxmlformats.org/drawingml/2006/picture">
+            <wp:extent cx="2763506" cy="1841500"/>
+            <wp:docPr id="8" name="Picture 8"/>
+            <wp:cNvGraphicFramePr>
+              <a:graphicFrameLocks noChangeAspect="1"/>
+            </wp:cNvGraphicFramePr>
+            <a:graphic>
+              <a:graphicData uri="http://schemas.openxmlformats.org/drawingml/2006/picture">
+                <pic:pic>
+                  <pic:nvPicPr>
+                    <pic:cNvPr id="0" name="desk.jpg"/>
+                    <pic:cNvPicPr/>
+                  </pic:nvPicPr>
+                  <pic:blipFill>
+                    <a:blip r:embed="rId14"/>
+                    <a:stretch>
+                      <a:fillRect/>
+                    </a:stretch>
+                  </pic:blipFill>
+                  <pic:spPr>
+                    <a:xfrm>
+                      <a:off x="0" y="0"/>
+                      <a:ext cx="2763506" cy="1841500"/>
+                    </a:xfrm>
+                    <a:prstGeom prst="rect"/>
+                  </pic:spPr>
+                </pic:pic>
+              </a:graphicData>
+            </a:graphic>
+          </wp:inline>
+        </w:drawing>
+      </w:r>
+    </w:p>
+    <w:p>
+      <w:pPr>
+        <w:keepNext/>
+      </w:pPr>
+      <w:r>
+        <w:rPr>
+          <w:b/>
+        </w:rPr>
+        <w:t>Shop page ID</w:t>
+      </w:r>
+    </w:p>
+    <w:p>
       <w:sdt>
         <w:sdtPr>
+          <w:alias w:val="Shop page ID"/>
           <w:tag w:val="product.page"/>
+          <w:text w:multiLine="1"/>
         </w:sdtPr>
         <w:sdtContent>
           <w:r>
@@ -1072,12 +2435,22 @@
       </w:sdt>
     </w:p>
     <w:p>
+      <w:pPr>
+        <w:keepNext/>
+      </w:pPr>
       <w:r>
-        <w:t/>
+        <w:rPr>
+          <w:b/>
+        </w:rPr>
+        <w:t>Product code</w:t>
       </w:r>
+    </w:p>
+    <w:p>
       <w:sdt>
         <w:sdtPr>
+          <w:alias w:val="Product code"/>
           <w:tag w:val="product.code"/>
+          <w:text w:multiLine="1"/>
         </w:sdtPr>
         <w:sdtContent>
           <w:r>
@@ -1087,12 +2460,22 @@
       </w:sdt>
     </w:p>
     <w:p>
+      <w:pPr>
+        <w:keepNext/>
+      </w:pPr>
       <w:r>
-        <w:t/>
+        <w:rPr>
+          <w:b/>
+        </w:rPr>
+        <w:t>Product name</w:t>
       </w:r>
+    </w:p>
+    <w:p>
       <w:sdt>
         <w:sdtPr>
+          <w:alias w:val="Product name"/>
           <w:tag w:val="product.name"/>
+          <w:text w:multiLine="1"/>
         </w:sdtPr>
         <w:sdtContent>
           <w:r>
@@ -1102,12 +2485,22 @@
       </w:sdt>
     </w:p>
     <w:p>
+      <w:pPr>
+        <w:keepNext/>
+      </w:pPr>
       <w:r>
-        <w:t/>
+        <w:rPr>
+          <w:b/>
+        </w:rPr>
+        <w:t>Price and currency</w:t>
       </w:r>
+    </w:p>
+    <w:p>
       <w:sdt>
         <w:sdtPr>
+          <w:alias w:val="Price and currency"/>
           <w:tag w:val="product.price"/>
+          <w:text w:multiLine="1"/>
         </w:sdtPr>
         <w:sdtContent>
           <w:r>
@@ -1117,42 +2510,72 @@
       </w:sdt>
     </w:p>
     <w:p>
+      <w:pPr>
+        <w:keepNext/>
+      </w:pPr>
       <w:r>
-        <w:t/>
+        <w:rPr>
+          <w:b/>
+        </w:rPr>
+        <w:t>Product description</w:t>
       </w:r>
+    </w:p>
+    <w:p>
       <w:sdt>
         <w:sdtPr>
+          <w:alias w:val="Product description"/>
           <w:tag w:val="product.description"/>
+          <w:text w:multiLine="1"/>
         </w:sdtPr>
         <w:sdtContent>
           <w:r>
-            <w:t>Illustrative furniture for your home.</w:t>
+            <w:t>A calmer corner for focused work. Room inspiration photo; example product only.</w:t>
           </w:r>
         </w:sdtContent>
       </w:sdt>
     </w:p>
     <w:p>
+      <w:pPr>
+        <w:keepNext/>
+      </w:pPr>
       <w:r>
-        <w:t/>
+        <w:rPr>
+          <w:b/>
+        </w:rPr>
+        <w:t>Category</w:t>
       </w:r>
+    </w:p>
+    <w:p>
       <w:sdt>
         <w:sdtPr>
+          <w:alias w:val="Category"/>
           <w:tag w:val="product.category"/>
+          <w:text w:multiLine="1"/>
         </w:sdtPr>
         <w:sdtContent>
           <w:r>
-            <w:t>Furniture</w:t>
+            <w:t>Office</w:t>
           </w:r>
         </w:sdtContent>
       </w:sdt>
     </w:p>
     <w:p>
+      <w:pPr>
+        <w:keepNext/>
+      </w:pPr>
       <w:r>
-        <w:t/>
+        <w:rPr>
+          <w:b/>
+        </w:rPr>
+        <w:t>Size and colour options</w:t>
       </w:r>
+    </w:p>
+    <w:p>
       <w:sdt>
         <w:sdtPr>
+          <w:alias w:val="Size and colour options"/>
           <w:tag w:val="product.options"/>
+          <w:text w:multiLine="1"/>
         </w:sdtPr>
         <w:sdtContent>
           <w:r>
@@ -1162,12 +2585,22 @@
       </w:sdt>
     </w:p>
     <w:p>
+      <w:pPr>
+        <w:keepNext/>
+      </w:pPr>
       <w:r>
-        <w:t/>
+        <w:rPr>
+          <w:b/>
+        </w:rPr>
+        <w:t>Availability</w:t>
       </w:r>
+    </w:p>
+    <w:p>
       <w:sdt>
         <w:sdtPr>
+          <w:alias w:val="Availability"/>
           <w:tag w:val="product.available"/>
+          <w:text w:multiLine="1"/>
         </w:sdtPr>
         <w:sdtContent>
           <w:r>
@@ -1177,17 +2610,101 @@
       </w:sdt>
     </w:p>
     <w:p>
+      <w:pPr>
+        <w:keepNext/>
+      </w:pPr>
+      <w:r>
+        <w:rPr>
+          <w:b/>
+        </w:rPr>
+        <w:t>Product image URL and description</w:t>
+      </w:r>
+    </w:p>
+    <w:p>
+      <w:sdt>
+        <w:sdtPr>
+          <w:alias w:val="Product image URL and description"/>
+          <w:tag w:val="product.image"/>
+          <w:text w:multiLine="1"/>
+        </w:sdtPr>
+        <w:sdtContent>
+          <w:r>
+            <w:t>https://ramakenkenya.github.io/rea-website-studio/example-photos/desk.jpg | A simple desk with a house plant and framed artwork</w:t>
+          </w:r>
+        </w:sdtContent>
+      </w:sdt>
+    </w:p>
+    <w:p>
+      <w:r>
+        <w:br w:type="page"/>
+      </w:r>
+    </w:p>
+    <w:p>
+      <w:pPr>
+        <w:pStyle w:val="Heading1"/>
+      </w:pPr>
       <w:r>
         <w:t>Product record</w:t>
       </w:r>
     </w:p>
     <w:p>
       <w:r>
-        <w:t/>
+        <w:t>Tulivu Bed</w:t>
       </w:r>
+    </w:p>
+    <w:p>
+      <w:r>
+        <w:drawing>
+          <wp:inline xmlns:a="http://schemas.openxmlformats.org/drawingml/2006/main" xmlns:pic="http://schemas.openxmlformats.org/drawingml/2006/picture">
+            <wp:extent cx="2763506" cy="1841500"/>
+            <wp:docPr id="9" name="Picture 9"/>
+            <wp:cNvGraphicFramePr>
+              <a:graphicFrameLocks noChangeAspect="1"/>
+            </wp:cNvGraphicFramePr>
+            <a:graphic>
+              <a:graphicData uri="http://schemas.openxmlformats.org/drawingml/2006/picture">
+                <pic:pic>
+                  <pic:nvPicPr>
+                    <pic:cNvPr id="0" name="bed.jpg"/>
+                    <pic:cNvPicPr/>
+                  </pic:nvPicPr>
+                  <pic:blipFill>
+                    <a:blip r:embed="rId15"/>
+                    <a:stretch>
+                      <a:fillRect/>
+                    </a:stretch>
+                  </pic:blipFill>
+                  <pic:spPr>
+                    <a:xfrm>
+                      <a:off x="0" y="0"/>
+                      <a:ext cx="2763506" cy="1841500"/>
+                    </a:xfrm>
+                    <a:prstGeom prst="rect"/>
+                  </pic:spPr>
+                </pic:pic>
+              </a:graphicData>
+            </a:graphic>
+          </wp:inline>
+        </w:drawing>
+      </w:r>
+    </w:p>
+    <w:p>
+      <w:pPr>
+        <w:keepNext/>
+      </w:pPr>
+      <w:r>
+        <w:rPr>
+          <w:b/>
+        </w:rPr>
+        <w:t>Shop page ID</w:t>
+      </w:r>
+    </w:p>
+    <w:p>
       <w:sdt>
         <w:sdtPr>
+          <w:alias w:val="Shop page ID"/>
           <w:tag w:val="product.page"/>
+          <w:text w:multiLine="1"/>
         </w:sdtPr>
         <w:sdtContent>
           <w:r>
@@ -1197,12 +2714,22 @@
       </w:sdt>
     </w:p>
     <w:p>
+      <w:pPr>
+        <w:keepNext/>
+      </w:pPr>
       <w:r>
-        <w:t/>
+        <w:rPr>
+          <w:b/>
+        </w:rPr>
+        <w:t>Product code</w:t>
       </w:r>
+    </w:p>
+    <w:p>
       <w:sdt>
         <w:sdtPr>
+          <w:alias w:val="Product code"/>
           <w:tag w:val="product.code"/>
+          <w:text w:multiLine="1"/>
         </w:sdtPr>
         <w:sdtContent>
           <w:r>
@@ -1212,12 +2739,22 @@
       </w:sdt>
     </w:p>
     <w:p>
+      <w:pPr>
+        <w:keepNext/>
+      </w:pPr>
       <w:r>
-        <w:t/>
+        <w:rPr>
+          <w:b/>
+        </w:rPr>
+        <w:t>Product name</w:t>
       </w:r>
+    </w:p>
+    <w:p>
       <w:sdt>
         <w:sdtPr>
+          <w:alias w:val="Product name"/>
           <w:tag w:val="product.name"/>
+          <w:text w:multiLine="1"/>
         </w:sdtPr>
         <w:sdtContent>
           <w:r>
@@ -1227,12 +2764,22 @@
       </w:sdt>
     </w:p>
     <w:p>
+      <w:pPr>
+        <w:keepNext/>
+      </w:pPr>
       <w:r>
-        <w:t/>
+        <w:rPr>
+          <w:b/>
+        </w:rPr>
+        <w:t>Price and currency</w:t>
       </w:r>
+    </w:p>
+    <w:p>
       <w:sdt>
         <w:sdtPr>
+          <w:alias w:val="Price and currency"/>
           <w:tag w:val="product.price"/>
+          <w:text w:multiLine="1"/>
         </w:sdtPr>
         <w:sdtContent>
           <w:r>
@@ -1242,42 +2789,72 @@
       </w:sdt>
     </w:p>
     <w:p>
+      <w:pPr>
+        <w:keepNext/>
+      </w:pPr>
       <w:r>
-        <w:t/>
+        <w:rPr>
+          <w:b/>
+        </w:rPr>
+        <w:t>Product description</w:t>
       </w:r>
+    </w:p>
+    <w:p>
       <w:sdt>
         <w:sdtPr>
+          <w:alias w:val="Product description"/>
           <w:tag w:val="product.description"/>
+          <w:text w:multiLine="1"/>
         </w:sdtPr>
         <w:sdtContent>
           <w:r>
-            <w:t>Illustrative furniture for your home.</w:t>
+            <w:t>Settle into a bedroom that feels like yours. Room inspiration photo; example product only.</w:t>
           </w:r>
         </w:sdtContent>
       </w:sdt>
     </w:p>
     <w:p>
+      <w:pPr>
+        <w:keepNext/>
+      </w:pPr>
       <w:r>
-        <w:t/>
+        <w:rPr>
+          <w:b/>
+        </w:rPr>
+        <w:t>Category</w:t>
       </w:r>
+    </w:p>
+    <w:p>
       <w:sdt>
         <w:sdtPr>
+          <w:alias w:val="Category"/>
           <w:tag w:val="product.category"/>
+          <w:text w:multiLine="1"/>
         </w:sdtPr>
         <w:sdtContent>
           <w:r>
-            <w:t>Furniture</w:t>
+            <w:t>Bedroom</w:t>
           </w:r>
         </w:sdtContent>
       </w:sdt>
     </w:p>
     <w:p>
+      <w:pPr>
+        <w:keepNext/>
+      </w:pPr>
       <w:r>
-        <w:t/>
+        <w:rPr>
+          <w:b/>
+        </w:rPr>
+        <w:t>Size and colour options</w:t>
       </w:r>
+    </w:p>
+    <w:p>
       <w:sdt>
         <w:sdtPr>
+          <w:alias w:val="Size and colour options"/>
           <w:tag w:val="product.options"/>
+          <w:text w:multiLine="1"/>
         </w:sdtPr>
         <w:sdtContent>
           <w:r>
@@ -1287,12 +2864,22 @@
       </w:sdt>
     </w:p>
     <w:p>
+      <w:pPr>
+        <w:keepNext/>
+      </w:pPr>
       <w:r>
-        <w:t/>
+        <w:rPr>
+          <w:b/>
+        </w:rPr>
+        <w:t>Availability</w:t>
       </w:r>
+    </w:p>
+    <w:p>
       <w:sdt>
         <w:sdtPr>
+          <w:alias w:val="Availability"/>
           <w:tag w:val="product.available"/>
+          <w:text w:multiLine="1"/>
         </w:sdtPr>
         <w:sdtContent>
           <w:r>
@@ -1302,17 +2889,101 @@
       </w:sdt>
     </w:p>
     <w:p>
+      <w:pPr>
+        <w:keepNext/>
+      </w:pPr>
+      <w:r>
+        <w:rPr>
+          <w:b/>
+        </w:rPr>
+        <w:t>Product image URL and description</w:t>
+      </w:r>
+    </w:p>
+    <w:p>
+      <w:sdt>
+        <w:sdtPr>
+          <w:alias w:val="Product image URL and description"/>
+          <w:tag w:val="product.image"/>
+          <w:text w:multiLine="1"/>
+        </w:sdtPr>
+        <w:sdtContent>
+          <w:r>
+            <w:t>https://ramakenkenya.github.io/rea-website-studio/example-photos/bed.jpg | A furnished bedroom with a bed and soft pillows</w:t>
+          </w:r>
+        </w:sdtContent>
+      </w:sdt>
+    </w:p>
+    <w:p>
+      <w:r>
+        <w:br w:type="page"/>
+      </w:r>
+    </w:p>
+    <w:p>
+      <w:pPr>
+        <w:pStyle w:val="Heading1"/>
+      </w:pPr>
       <w:r>
         <w:t>Product record</w:t>
       </w:r>
     </w:p>
     <w:p>
       <w:r>
-        <w:t/>
+        <w:t>Nyumba TV Stand</w:t>
       </w:r>
+    </w:p>
+    <w:p>
+      <w:r>
+        <w:drawing>
+          <wp:inline xmlns:a="http://schemas.openxmlformats.org/drawingml/2006/main" xmlns:pic="http://schemas.openxmlformats.org/drawingml/2006/picture">
+            <wp:extent cx="2763506" cy="1841500"/>
+            <wp:docPr id="10" name="Picture 10"/>
+            <wp:cNvGraphicFramePr>
+              <a:graphicFrameLocks noChangeAspect="1"/>
+            </wp:cNvGraphicFramePr>
+            <a:graphic>
+              <a:graphicData uri="http://schemas.openxmlformats.org/drawingml/2006/picture">
+                <pic:pic>
+                  <pic:nvPicPr>
+                    <pic:cNvPr id="0" name="tv.jpg"/>
+                    <pic:cNvPicPr/>
+                  </pic:nvPicPr>
+                  <pic:blipFill>
+                    <a:blip r:embed="rId16"/>
+                    <a:stretch>
+                      <a:fillRect/>
+                    </a:stretch>
+                  </pic:blipFill>
+                  <pic:spPr>
+                    <a:xfrm>
+                      <a:off x="0" y="0"/>
+                      <a:ext cx="2763506" cy="1841500"/>
+                    </a:xfrm>
+                    <a:prstGeom prst="rect"/>
+                  </pic:spPr>
+                </pic:pic>
+              </a:graphicData>
+            </a:graphic>
+          </wp:inline>
+        </w:drawing>
+      </w:r>
+    </w:p>
+    <w:p>
+      <w:pPr>
+        <w:keepNext/>
+      </w:pPr>
+      <w:r>
+        <w:rPr>
+          <w:b/>
+        </w:rPr>
+        <w:t>Shop page ID</w:t>
+      </w:r>
+    </w:p>
+    <w:p>
       <w:sdt>
         <w:sdtPr>
+          <w:alias w:val="Shop page ID"/>
           <w:tag w:val="product.page"/>
+          <w:text w:multiLine="1"/>
         </w:sdtPr>
         <w:sdtContent>
           <w:r>
@@ -1322,12 +2993,22 @@
       </w:sdt>
     </w:p>
     <w:p>
+      <w:pPr>
+        <w:keepNext/>
+      </w:pPr>
       <w:r>
-        <w:t/>
+        <w:rPr>
+          <w:b/>
+        </w:rPr>
+        <w:t>Product code</w:t>
       </w:r>
+    </w:p>
+    <w:p>
       <w:sdt>
         <w:sdtPr>
+          <w:alias w:val="Product code"/>
           <w:tag w:val="product.code"/>
+          <w:text w:multiLine="1"/>
         </w:sdtPr>
         <w:sdtContent>
           <w:r>
@@ -1337,12 +3018,22 @@
       </w:sdt>
     </w:p>
     <w:p>
+      <w:pPr>
+        <w:keepNext/>
+      </w:pPr>
       <w:r>
-        <w:t/>
+        <w:rPr>
+          <w:b/>
+        </w:rPr>
+        <w:t>Product name</w:t>
       </w:r>
+    </w:p>
+    <w:p>
       <w:sdt>
         <w:sdtPr>
+          <w:alias w:val="Product name"/>
           <w:tag w:val="product.name"/>
+          <w:text w:multiLine="1"/>
         </w:sdtPr>
         <w:sdtContent>
           <w:r>
@@ -1352,12 +3043,22 @@
       </w:sdt>
     </w:p>
     <w:p>
+      <w:pPr>
+        <w:keepNext/>
+      </w:pPr>
       <w:r>
-        <w:t/>
+        <w:rPr>
+          <w:b/>
+        </w:rPr>
+        <w:t>Price and currency</w:t>
       </w:r>
+    </w:p>
+    <w:p>
       <w:sdt>
         <w:sdtPr>
+          <w:alias w:val="Price and currency"/>
           <w:tag w:val="product.price"/>
+          <w:text w:multiLine="1"/>
         </w:sdtPr>
         <w:sdtContent>
           <w:r>
@@ -1367,42 +3068,72 @@
       </w:sdt>
     </w:p>
     <w:p>
+      <w:pPr>
+        <w:keepNext/>
+      </w:pPr>
       <w:r>
-        <w:t/>
+        <w:rPr>
+          <w:b/>
+        </w:rPr>
+        <w:t>Product description</w:t>
       </w:r>
+    </w:p>
+    <w:p>
       <w:sdt>
         <w:sdtPr>
+          <w:alias w:val="Product description"/>
           <w:tag w:val="product.description"/>
+          <w:text w:multiLine="1"/>
         </w:sdtPr>
         <w:sdtContent>
           <w:r>
-            <w:t>Illustrative furniture for your home.</w:t>
+            <w:t>Keep the living room organised around the things you enjoy. Room inspiration photo; example product only.</w:t>
           </w:r>
         </w:sdtContent>
       </w:sdt>
     </w:p>
     <w:p>
+      <w:pPr>
+        <w:keepNext/>
+      </w:pPr>
       <w:r>
-        <w:t/>
+        <w:rPr>
+          <w:b/>
+        </w:rPr>
+        <w:t>Category</w:t>
       </w:r>
+    </w:p>
+    <w:p>
       <w:sdt>
         <w:sdtPr>
+          <w:alias w:val="Category"/>
           <w:tag w:val="product.category"/>
+          <w:text w:multiLine="1"/>
         </w:sdtPr>
         <w:sdtContent>
           <w:r>
-            <w:t>Furniture</w:t>
+            <w:t>Storage</w:t>
           </w:r>
         </w:sdtContent>
       </w:sdt>
     </w:p>
     <w:p>
+      <w:pPr>
+        <w:keepNext/>
+      </w:pPr>
       <w:r>
-        <w:t/>
+        <w:rPr>
+          <w:b/>
+        </w:rPr>
+        <w:t>Size and colour options</w:t>
       </w:r>
+    </w:p>
+    <w:p>
       <w:sdt>
         <w:sdtPr>
+          <w:alias w:val="Size and colour options"/>
           <w:tag w:val="product.options"/>
+          <w:text w:multiLine="1"/>
         </w:sdtPr>
         <w:sdtContent>
           <w:r>
@@ -1412,12 +3143,22 @@
       </w:sdt>
     </w:p>
     <w:p>
+      <w:pPr>
+        <w:keepNext/>
+      </w:pPr>
       <w:r>
-        <w:t/>
+        <w:rPr>
+          <w:b/>
+        </w:rPr>
+        <w:t>Availability</w:t>
       </w:r>
+    </w:p>
+    <w:p>
       <w:sdt>
         <w:sdtPr>
+          <w:alias w:val="Availability"/>
           <w:tag w:val="product.available"/>
+          <w:text w:multiLine="1"/>
         </w:sdtPr>
         <w:sdtContent>
           <w:r>
@@ -1427,17 +3168,101 @@
       </w:sdt>
     </w:p>
     <w:p>
+      <w:pPr>
+        <w:keepNext/>
+      </w:pPr>
+      <w:r>
+        <w:rPr>
+          <w:b/>
+        </w:rPr>
+        <w:t>Product image URL and description</w:t>
+      </w:r>
+    </w:p>
+    <w:p>
+      <w:sdt>
+        <w:sdtPr>
+          <w:alias w:val="Product image URL and description"/>
+          <w:tag w:val="product.image"/>
+          <w:text w:multiLine="1"/>
+        </w:sdtPr>
+        <w:sdtContent>
+          <w:r>
+            <w:t>https://ramakenkenya.github.io/rea-website-studio/example-photos/tv.jpg | A television and low cabinet in a minimal living room</w:t>
+          </w:r>
+        </w:sdtContent>
+      </w:sdt>
+    </w:p>
+    <w:p>
+      <w:r>
+        <w:br w:type="page"/>
+      </w:r>
+    </w:p>
+    <w:p>
+      <w:pPr>
+        <w:pStyle w:val="Heading1"/>
+      </w:pPr>
       <w:r>
         <w:t>Product record</w:t>
       </w:r>
     </w:p>
     <w:p>
       <w:r>
-        <w:t/>
+        <w:t>Soma Bookshelf</w:t>
       </w:r>
+    </w:p>
+    <w:p>
+      <w:r>
+        <w:drawing>
+          <wp:inline xmlns:a="http://schemas.openxmlformats.org/drawingml/2006/main" xmlns:pic="http://schemas.openxmlformats.org/drawingml/2006/picture">
+            <wp:extent cx="2763506" cy="1841500"/>
+            <wp:docPr id="11" name="Picture 11"/>
+            <wp:cNvGraphicFramePr>
+              <a:graphicFrameLocks noChangeAspect="1"/>
+            </wp:cNvGraphicFramePr>
+            <a:graphic>
+              <a:graphicData uri="http://schemas.openxmlformats.org/drawingml/2006/picture">
+                <pic:pic>
+                  <pic:nvPicPr>
+                    <pic:cNvPr id="0" name="shelf.jpg"/>
+                    <pic:cNvPicPr/>
+                  </pic:nvPicPr>
+                  <pic:blipFill>
+                    <a:blip r:embed="rId17"/>
+                    <a:stretch>
+                      <a:fillRect/>
+                    </a:stretch>
+                  </pic:blipFill>
+                  <pic:spPr>
+                    <a:xfrm>
+                      <a:off x="0" y="0"/>
+                      <a:ext cx="2763506" cy="1841500"/>
+                    </a:xfrm>
+                    <a:prstGeom prst="rect"/>
+                  </pic:spPr>
+                </pic:pic>
+              </a:graphicData>
+            </a:graphic>
+          </wp:inline>
+        </w:drawing>
+      </w:r>
+    </w:p>
+    <w:p>
+      <w:pPr>
+        <w:keepNext/>
+      </w:pPr>
+      <w:r>
+        <w:rPr>
+          <w:b/>
+        </w:rPr>
+        <w:t>Shop page ID</w:t>
+      </w:r>
+    </w:p>
+    <w:p>
       <w:sdt>
         <w:sdtPr>
+          <w:alias w:val="Shop page ID"/>
           <w:tag w:val="product.page"/>
+          <w:text w:multiLine="1"/>
         </w:sdtPr>
         <w:sdtContent>
           <w:r>
@@ -1447,12 +3272,22 @@
       </w:sdt>
     </w:p>
     <w:p>
+      <w:pPr>
+        <w:keepNext/>
+      </w:pPr>
       <w:r>
-        <w:t/>
+        <w:rPr>
+          <w:b/>
+        </w:rPr>
+        <w:t>Product code</w:t>
       </w:r>
+    </w:p>
+    <w:p>
       <w:sdt>
         <w:sdtPr>
+          <w:alias w:val="Product code"/>
           <w:tag w:val="product.code"/>
+          <w:text w:multiLine="1"/>
         </w:sdtPr>
         <w:sdtContent>
           <w:r>
@@ -1462,12 +3297,22 @@
       </w:sdt>
     </w:p>
     <w:p>
+      <w:pPr>
+        <w:keepNext/>
+      </w:pPr>
       <w:r>
-        <w:t/>
+        <w:rPr>
+          <w:b/>
+        </w:rPr>
+        <w:t>Product name</w:t>
       </w:r>
+    </w:p>
+    <w:p>
       <w:sdt>
         <w:sdtPr>
+          <w:alias w:val="Product name"/>
           <w:tag w:val="product.name"/>
+          <w:text w:multiLine="1"/>
         </w:sdtPr>
         <w:sdtContent>
           <w:r>
@@ -1477,12 +3322,22 @@
       </w:sdt>
     </w:p>
     <w:p>
+      <w:pPr>
+        <w:keepNext/>
+      </w:pPr>
       <w:r>
-        <w:t/>
+        <w:rPr>
+          <w:b/>
+        </w:rPr>
+        <w:t>Price and currency</w:t>
       </w:r>
+    </w:p>
+    <w:p>
       <w:sdt>
         <w:sdtPr>
+          <w:alias w:val="Price and currency"/>
           <w:tag w:val="product.price"/>
+          <w:text w:multiLine="1"/>
         </w:sdtPr>
         <w:sdtContent>
           <w:r>
@@ -1492,42 +3347,72 @@
       </w:sdt>
     </w:p>
     <w:p>
+      <w:pPr>
+        <w:keepNext/>
+      </w:pPr>
       <w:r>
-        <w:t/>
+        <w:rPr>
+          <w:b/>
+        </w:rPr>
+        <w:t>Product description</w:t>
       </w:r>
+    </w:p>
+    <w:p>
       <w:sdt>
         <w:sdtPr>
+          <w:alias w:val="Product description"/>
           <w:tag w:val="product.description"/>
+          <w:text w:multiLine="1"/>
         </w:sdtPr>
         <w:sdtContent>
           <w:r>
-            <w:t>Illustrative furniture for your home.</w:t>
+            <w:t>Give books, keepsakes and favourite objects a home. Room inspiration photo; example product only.</w:t>
           </w:r>
         </w:sdtContent>
       </w:sdt>
     </w:p>
     <w:p>
+      <w:pPr>
+        <w:keepNext/>
+      </w:pPr>
       <w:r>
-        <w:t/>
+        <w:rPr>
+          <w:b/>
+        </w:rPr>
+        <w:t>Category</w:t>
       </w:r>
+    </w:p>
+    <w:p>
       <w:sdt>
         <w:sdtPr>
+          <w:alias w:val="Category"/>
           <w:tag w:val="product.category"/>
+          <w:text w:multiLine="1"/>
         </w:sdtPr>
         <w:sdtContent>
           <w:r>
-            <w:t>Furniture</w:t>
+            <w:t>Storage</w:t>
           </w:r>
         </w:sdtContent>
       </w:sdt>
     </w:p>
     <w:p>
+      <w:pPr>
+        <w:keepNext/>
+      </w:pPr>
       <w:r>
-        <w:t/>
+        <w:rPr>
+          <w:b/>
+        </w:rPr>
+        <w:t>Size and colour options</w:t>
       </w:r>
+    </w:p>
+    <w:p>
       <w:sdt>
         <w:sdtPr>
+          <w:alias w:val="Size and colour options"/>
           <w:tag w:val="product.options"/>
+          <w:text w:multiLine="1"/>
         </w:sdtPr>
         <w:sdtContent>
           <w:r>
@@ -1537,12 +3422,22 @@
       </w:sdt>
     </w:p>
     <w:p>
+      <w:pPr>
+        <w:keepNext/>
+      </w:pPr>
       <w:r>
-        <w:t/>
+        <w:rPr>
+          <w:b/>
+        </w:rPr>
+        <w:t>Availability</w:t>
       </w:r>
+    </w:p>
+    <w:p>
       <w:sdt>
         <w:sdtPr>
+          <w:alias w:val="Availability"/>
           <w:tag w:val="product.available"/>
+          <w:text w:multiLine="1"/>
         </w:sdtPr>
         <w:sdtContent>
           <w:r>
@@ -1552,17 +3447,65 @@
       </w:sdt>
     </w:p>
     <w:p>
+      <w:pPr>
+        <w:keepNext/>
+      </w:pPr>
+      <w:r>
+        <w:rPr>
+          <w:b/>
+        </w:rPr>
+        <w:t>Product image URL and description</w:t>
+      </w:r>
+    </w:p>
+    <w:p>
+      <w:sdt>
+        <w:sdtPr>
+          <w:alias w:val="Product image URL and description"/>
+          <w:tag w:val="product.image"/>
+          <w:text w:multiLine="1"/>
+        </w:sdtPr>
+        <w:sdtContent>
+          <w:r>
+            <w:t>https://ramakenkenya.github.io/rea-website-studio/example-photos/shelf.jpg | A bookshelf in a London interior</w:t>
+          </w:r>
+        </w:sdtContent>
+      </w:sdt>
+    </w:p>
+    <w:p>
+      <w:r>
+        <w:br w:type="page"/>
+      </w:r>
+    </w:p>
+    <w:p>
+      <w:pPr>
+        <w:pStyle w:val="Heading1"/>
+      </w:pPr>
       <w:r>
         <w:t>Photos and questions</w:t>
       </w:r>
     </w:p>
     <w:p>
       <w:r>
-        <w:t/>
+        <w:t>rooms</w:t>
       </w:r>
+    </w:p>
+    <w:p>
+      <w:pPr>
+        <w:keepNext/>
+      </w:pPr>
+      <w:r>
+        <w:rPr>
+          <w:b/>
+        </w:rPr>
+        <w:t>Gallery section ID</w:t>
+      </w:r>
+    </w:p>
+    <w:p>
       <w:sdt>
         <w:sdtPr>
+          <w:alias w:val="Gallery section ID"/>
           <w:tag w:val="gallery.section"/>
+          <w:text w:multiLine="1"/>
         </w:sdtPr>
         <w:sdtContent>
           <w:r>
@@ -1572,47 +3515,154 @@
       </w:sdt>
     </w:p>
     <w:p>
+      <w:pPr>
+        <w:keepNext/>
+      </w:pPr>
       <w:r>
-        <w:t/>
+        <w:rPr>
+          <w:b/>
+        </w:rPr>
+        <w:t>Gallery photos</w:t>
       </w:r>
+    </w:p>
+    <w:p>
       <w:sdt>
         <w:sdtPr>
+          <w:alias w:val="Gallery photos"/>
           <w:tag w:val="gallery.images"/>
+          <w:text w:multiLine="1"/>
         </w:sdtPr>
         <w:sdtContent>
           <w:r>
-            <w:t>https://images.example/room.jpg | A comfortable living room | Room to relax</w:t>
+            <w:t>https://ramakenkenya.github.io/rea-website-studio/example-photos/living.jpg | A light living room with a sofa and natural wood furniture | A light living room with a sofa and natural wood furniture</w:t>
+          </w:r>
+          <w:r>
+            <w:br/>
+            <w:t>https://ramakenkenya.github.io/rea-website-studio/example-photos/sofa.jpg | A comfortable sofa in a bright furnished room | A comfortable sofa in a bright furnished room</w:t>
+          </w:r>
+          <w:r>
+            <w:br/>
+            <w:t>https://ramakenkenya.github.io/rea-website-studio/example-photos/dining.jpg | A wooden dining table with chairs | A wooden dining table with chairs</w:t>
+          </w:r>
+          <w:r>
+            <w:br/>
+            <w:t>https://ramakenkenya.github.io/rea-website-studio/example-photos/bed.jpg | A furnished bedroom with a bed and soft pillows | A furnished bedroom with a bed and soft pillows</w:t>
+          </w:r>
+          <w:r>
+            <w:br/>
+            <w:t>https://ramakenkenya.github.io/rea-website-studio/example-photos/tv.jpg | A television and low cabinet in a minimal living room | A television and low cabinet in a minimal living room</w:t>
+          </w:r>
+          <w:r>
+            <w:br/>
+            <w:t>https://ramakenkenya.github.io/rea-website-studio/example-photos/shelf.jpg | A bookshelf in a London interior | A bookshelf in a London interior</w:t>
+          </w:r>
+          <w:r>
+            <w:br/>
+            <w:t>https://ramakenkenya.github.io/rea-website-studio/example-photos/desk.jpg | A simple desk with a house plant and framed artwork | A simple desk with a house plant and framed artwork</w:t>
+          </w:r>
+          <w:r>
+            <w:br/>
+            <w:t>https://ramakenkenya.github.io/rea-website-studio/example-photos/original-1.jpg | An eclectic living room photographed by Carlos ZGZ | An eclectic living room photographed by Carlos ZGZ</w:t>
+          </w:r>
+          <w:r>
+            <w:br/>
+            <w:t>https://ramakenkenya.github.io/rea-website-studio/example-photos/original-2.jpg | A furnished living room with shelves and seating | A furnished living room with shelves and seating</w:t>
           </w:r>
         </w:sdtContent>
       </w:sdt>
     </w:p>
     <w:p>
+      <w:pPr>
+        <w:keepNext/>
+      </w:pPr>
       <w:r>
-        <w:t/>
+        <w:rPr>
+          <w:b/>
+        </w:rPr>
+        <w:t>Photo credits and licence information</w:t>
       </w:r>
+    </w:p>
+    <w:p>
       <w:sdt>
         <w:sdtPr>
+          <w:alias w:val="Photo credits and licence information"/>
           <w:tag w:val="gallery.credits"/>
+          <w:text w:multiLine="1"/>
         </w:sdtPr>
         <w:sdtContent>
           <w:r>
-            <w:t>https://images.example/room.jpg | Demo Photographer | https://example.com/photo | CC0</w:t>
+            <w:t>https://ramakenkenya.github.io/rea-website-studio/example-photos/living.jpg | Erika Wittlieb | https://isorepublic.com/photo/living-room-interior/ | CC0</w:t>
+          </w:r>
+          <w:r>
+            <w:br/>
+            <w:t>https://ramakenkenya.github.io/rea-website-studio/example-photos/sofa.jpg | Hency Xu | https://isorepublic.com/photo/sofa-in-room/ | CC0</w:t>
+          </w:r>
+          <w:r>
+            <w:br/>
+            <w:t>https://ramakenkenya.github.io/rea-website-studio/example-photos/dining.jpg | Erika Wittlieb | https://isorepublic.com/photo/dining-table/ | CC0</w:t>
+          </w:r>
+          <w:r>
+            <w:br/>
+            <w:t>https://ramakenkenya.github.io/rea-website-studio/example-photos/bed.jpg | Erika Wittlieb | https://isorepublic.com/photo/interior-of-bedroom/ | CC0</w:t>
+          </w:r>
+          <w:r>
+            <w:br/>
+            <w:t>https://ramakenkenya.github.io/rea-website-studio/example-photos/tv.jpg | Patrick Perkins | https://isorepublic.com/photo/television-in-room/ | CC0</w:t>
+          </w:r>
+          <w:r>
+            <w:br/>
+            <w:t>https://ramakenkenya.github.io/rea-website-studio/example-photos/shelf.jpg | ISO Legacy | https://isorepublic.com/photo/london-bookshelf/ | CC0</w:t>
+          </w:r>
+          <w:r>
+            <w:br/>
+            <w:t>https://ramakenkenya.github.io/rea-website-studio/example-photos/desk.jpg | Kristin Hardwick | https://isorepublic.com/photo/house-plant-desk/ | CC0</w:t>
+          </w:r>
+          <w:r>
+            <w:br/>
+            <w:t>https://ramakenkenya.github.io/rea-website-studio/example-photos/original-1.jpg | Carlos ZGZ from Paris, France | https://commons.wikimedia.org/wiki/File:Living_room_(15246771173).jpg | CC0</w:t>
+          </w:r>
+          <w:r>
+            <w:br/>
+            <w:t>https://ramakenkenya.github.io/rea-website-studio/example-photos/original-2.jpg | Lo | https://commons.wikimedia.org/wiki/File:The_living_room_that_needs_houseplants.jpg | CC0</w:t>
           </w:r>
         </w:sdtContent>
       </w:sdt>
     </w:p>
     <w:p>
       <w:r>
+        <w:br w:type="page"/>
+      </w:r>
+    </w:p>
+    <w:p>
+      <w:pPr>
+        <w:pStyle w:val="Heading1"/>
+      </w:pPr>
+      <w:r>
         <w:t>Photos and questions</w:t>
       </w:r>
     </w:p>
     <w:p>
       <w:r>
-        <w:t/>
+        <w:t>help</w:t>
       </w:r>
+    </w:p>
+    <w:p>
+      <w:pPr>
+        <w:keepNext/>
+      </w:pPr>
+      <w:r>
+        <w:rPr>
+          <w:b/>
+        </w:rPr>
+        <w:t>FAQ section ID</w:t>
+      </w:r>
+    </w:p>
+    <w:p>
       <w:sdt>
         <w:sdtPr>
+          <w:alias w:val="FAQ section ID"/>
           <w:tag w:val="faq.section"/>
+          <w:text w:multiLine="1"/>
         </w:sdtPr>
         <w:sdtContent>
           <w:r>
@@ -1622,56 +3672,517 @@
       </w:sdt>
     </w:p>
     <w:p>
+      <w:pPr>
+        <w:keepNext/>
+      </w:pPr>
       <w:r>
-        <w:t/>
+        <w:rPr>
+          <w:b/>
+        </w:rPr>
+        <w:t>Questions and answers</w:t>
       </w:r>
+    </w:p>
+    <w:p>
       <w:sdt>
         <w:sdtPr>
+          <w:alias w:val="Questions and answers"/>
           <w:tag w:val="faq.items"/>
+          <w:text w:multiLine="1"/>
         </w:sdtPr>
         <w:sdtContent>
           <w:r>
-            <w:t>Can I pay here? | No payments are taken on this demonstration.
-How do I order? | Prepare a shopping list.</w:t>
+            <w:t>Can I pay here? | This fictional demonstration takes no payments.</w:t>
+          </w:r>
+          <w:r>
+            <w:br/>
+            <w:t>How do I order? | Add products to a shopping list, then review the request. A real business can add its WhatsApp number in Studio tools.</w:t>
+          </w:r>
+          <w:r>
+            <w:br/>
+            <w:t>Are these exact product photos? | No. These CC0 photos illustrate room ideas. Products and prices are examples.</w:t>
           </w:r>
         </w:sdtContent>
       </w:sdt>
     </w:p>
+    <w:p>
+      <w:r>
+        <w:br w:type="page"/>
+      </w:r>
+    </w:p>
+    <w:p>
+      <w:pPr>
+        <w:pStyle w:val="Heading1"/>
+      </w:pPr>
+      <w:r>
+        <w:t>Photo sources</w:t>
+      </w:r>
+    </w:p>
+    <w:p>
+      <w:r>
+        <w:t>CC0 1.0 Universal - original creators and source pages</w:t>
+      </w:r>
+    </w:p>
+    <w:p>
+      <w:r>
+        <w:t>All nine images were checked against the source pages and CC0 licence on 29 October 2026. The two original Wikimedia images are included alongside furniture and room photographs from ISO Republic. Copies were resized and compressed for the example.</w:t>
+      </w:r>
+    </w:p>
+    <w:p>
+      <w:r>
+        <w:t>Licence: https://creativecommons.org/publicdomain/zero/1.0/</w:t>
+        <w:br/>
+        <w:t>ISO Republic licence: https://isorepublic.com/license/</w:t>
+      </w:r>
+    </w:p>
+    <w:p>
+      <w:r>
+        <w:drawing>
+          <wp:inline xmlns:a="http://schemas.openxmlformats.org/drawingml/2006/main" xmlns:pic="http://schemas.openxmlformats.org/drawingml/2006/picture">
+            <wp:extent cx="1905866" cy="1270000"/>
+            <wp:docPr id="12" name="Picture 12"/>
+            <wp:cNvGraphicFramePr>
+              <a:graphicFrameLocks noChangeAspect="1"/>
+            </wp:cNvGraphicFramePr>
+            <a:graphic>
+              <a:graphicData uri="http://schemas.openxmlformats.org/drawingml/2006/picture">
+                <pic:pic>
+                  <pic:nvPicPr>
+                    <pic:cNvPr id="0" name="living.jpg"/>
+                    <pic:cNvPicPr/>
+                  </pic:nvPicPr>
+                  <pic:blipFill>
+                    <a:blip r:embed="rId9"/>
+                    <a:stretch>
+                      <a:fillRect/>
+                    </a:stretch>
+                  </pic:blipFill>
+                  <pic:spPr>
+                    <a:xfrm>
+                      <a:off x="0" y="0"/>
+                      <a:ext cx="1905866" cy="1270000"/>
+                    </a:xfrm>
+                    <a:prstGeom prst="rect"/>
+                  </pic:spPr>
+                </pic:pic>
+              </a:graphicData>
+            </a:graphic>
+          </wp:inline>
+        </w:drawing>
+      </w:r>
+    </w:p>
+    <w:p>
+      <w:r>
+        <w:t>A light living room with a sofa and natural wood furniture</w:t>
+        <w:br/>
+        <w:t>Erika Wittlieb | CC0</w:t>
+        <w:br/>
+        <w:t>https://isorepublic.com/photo/living-room-interior/</w:t>
+      </w:r>
+    </w:p>
+    <w:p>
+      <w:r>
+        <w:drawing>
+          <wp:inline xmlns:a="http://schemas.openxmlformats.org/drawingml/2006/main" xmlns:pic="http://schemas.openxmlformats.org/drawingml/2006/picture">
+            <wp:extent cx="1905866" cy="1270000"/>
+            <wp:docPr id="13" name="Picture 13"/>
+            <wp:cNvGraphicFramePr>
+              <a:graphicFrameLocks noChangeAspect="1"/>
+            </wp:cNvGraphicFramePr>
+            <a:graphic>
+              <a:graphicData uri="http://schemas.openxmlformats.org/drawingml/2006/picture">
+                <pic:pic>
+                  <pic:nvPicPr>
+                    <pic:cNvPr id="0" name="sofa.jpg"/>
+                    <pic:cNvPicPr/>
+                  </pic:nvPicPr>
+                  <pic:blipFill>
+                    <a:blip r:embed="rId13"/>
+                    <a:stretch>
+                      <a:fillRect/>
+                    </a:stretch>
+                  </pic:blipFill>
+                  <pic:spPr>
+                    <a:xfrm>
+                      <a:off x="0" y="0"/>
+                      <a:ext cx="1905866" cy="1270000"/>
+                    </a:xfrm>
+                    <a:prstGeom prst="rect"/>
+                  </pic:spPr>
+                </pic:pic>
+              </a:graphicData>
+            </a:graphic>
+          </wp:inline>
+        </w:drawing>
+      </w:r>
+    </w:p>
+    <w:p>
+      <w:r>
+        <w:t>A comfortable sofa in a bright furnished room</w:t>
+        <w:br/>
+        <w:t>Hency Xu | CC0</w:t>
+        <w:br/>
+        <w:t>https://isorepublic.com/photo/sofa-in-room/</w:t>
+      </w:r>
+    </w:p>
+    <w:p>
+      <w:r>
+        <w:drawing>
+          <wp:inline xmlns:a="http://schemas.openxmlformats.org/drawingml/2006/main" xmlns:pic="http://schemas.openxmlformats.org/drawingml/2006/picture">
+            <wp:extent cx="1905866" cy="1270000"/>
+            <wp:docPr id="14" name="Picture 14"/>
+            <wp:cNvGraphicFramePr>
+              <a:graphicFrameLocks noChangeAspect="1"/>
+            </wp:cNvGraphicFramePr>
+            <a:graphic>
+              <a:graphicData uri="http://schemas.openxmlformats.org/drawingml/2006/picture">
+                <pic:pic>
+                  <pic:nvPicPr>
+                    <pic:cNvPr id="0" name="dining.jpg"/>
+                    <pic:cNvPicPr/>
+                  </pic:nvPicPr>
+                  <pic:blipFill>
+                    <a:blip r:embed="rId10"/>
+                    <a:stretch>
+                      <a:fillRect/>
+                    </a:stretch>
+                  </pic:blipFill>
+                  <pic:spPr>
+                    <a:xfrm>
+                      <a:off x="0" y="0"/>
+                      <a:ext cx="1905866" cy="1270000"/>
+                    </a:xfrm>
+                    <a:prstGeom prst="rect"/>
+                  </pic:spPr>
+                </pic:pic>
+              </a:graphicData>
+            </a:graphic>
+          </wp:inline>
+        </w:drawing>
+      </w:r>
+    </w:p>
+    <w:p>
+      <w:r>
+        <w:t>A wooden dining table with chairs</w:t>
+        <w:br/>
+        <w:t>Erika Wittlieb | CC0</w:t>
+        <w:br/>
+        <w:t>https://isorepublic.com/photo/dining-table/</w:t>
+      </w:r>
+    </w:p>
+    <w:p>
+      <w:r>
+        <w:br w:type="page"/>
+      </w:r>
+    </w:p>
+    <w:p>
+      <w:pPr>
+        <w:pStyle w:val="Heading1"/>
+      </w:pPr>
+      <w:r>
+        <w:t>Photo sources</w:t>
+      </w:r>
+    </w:p>
+    <w:p>
+      <w:r>
+        <w:t>Continued</w:t>
+      </w:r>
+    </w:p>
+    <w:p>
+      <w:r>
+        <w:drawing>
+          <wp:inline xmlns:a="http://schemas.openxmlformats.org/drawingml/2006/main" xmlns:pic="http://schemas.openxmlformats.org/drawingml/2006/picture">
+            <wp:extent cx="1905866" cy="1270000"/>
+            <wp:docPr id="15" name="Picture 15"/>
+            <wp:cNvGraphicFramePr>
+              <a:graphicFrameLocks noChangeAspect="1"/>
+            </wp:cNvGraphicFramePr>
+            <a:graphic>
+              <a:graphicData uri="http://schemas.openxmlformats.org/drawingml/2006/picture">
+                <pic:pic>
+                  <pic:nvPicPr>
+                    <pic:cNvPr id="0" name="bed.jpg"/>
+                    <pic:cNvPicPr/>
+                  </pic:nvPicPr>
+                  <pic:blipFill>
+                    <a:blip r:embed="rId15"/>
+                    <a:stretch>
+                      <a:fillRect/>
+                    </a:stretch>
+                  </pic:blipFill>
+                  <pic:spPr>
+                    <a:xfrm>
+                      <a:off x="0" y="0"/>
+                      <a:ext cx="1905866" cy="1270000"/>
+                    </a:xfrm>
+                    <a:prstGeom prst="rect"/>
+                  </pic:spPr>
+                </pic:pic>
+              </a:graphicData>
+            </a:graphic>
+          </wp:inline>
+        </w:drawing>
+      </w:r>
+    </w:p>
+    <w:p>
+      <w:r>
+        <w:t>A furnished bedroom with a bed and soft pillows</w:t>
+        <w:br/>
+        <w:t>Erika Wittlieb | CC0</w:t>
+        <w:br/>
+        <w:t>https://isorepublic.com/photo/interior-of-bedroom/</w:t>
+      </w:r>
+    </w:p>
+    <w:p>
+      <w:r>
+        <w:drawing>
+          <wp:inline xmlns:a="http://schemas.openxmlformats.org/drawingml/2006/main" xmlns:pic="http://schemas.openxmlformats.org/drawingml/2006/picture">
+            <wp:extent cx="1905866" cy="1270000"/>
+            <wp:docPr id="16" name="Picture 16"/>
+            <wp:cNvGraphicFramePr>
+              <a:graphicFrameLocks noChangeAspect="1"/>
+            </wp:cNvGraphicFramePr>
+            <a:graphic>
+              <a:graphicData uri="http://schemas.openxmlformats.org/drawingml/2006/picture">
+                <pic:pic>
+                  <pic:nvPicPr>
+                    <pic:cNvPr id="0" name="tv.jpg"/>
+                    <pic:cNvPicPr/>
+                  </pic:nvPicPr>
+                  <pic:blipFill>
+                    <a:blip r:embed="rId16"/>
+                    <a:stretch>
+                      <a:fillRect/>
+                    </a:stretch>
+                  </pic:blipFill>
+                  <pic:spPr>
+                    <a:xfrm>
+                      <a:off x="0" y="0"/>
+                      <a:ext cx="1905866" cy="1270000"/>
+                    </a:xfrm>
+                    <a:prstGeom prst="rect"/>
+                  </pic:spPr>
+                </pic:pic>
+              </a:graphicData>
+            </a:graphic>
+          </wp:inline>
+        </w:drawing>
+      </w:r>
+    </w:p>
+    <w:p>
+      <w:r>
+        <w:t>A television and low cabinet in a minimal living room</w:t>
+        <w:br/>
+        <w:t>Patrick Perkins | CC0</w:t>
+        <w:br/>
+        <w:t>https://isorepublic.com/photo/television-in-room/</w:t>
+      </w:r>
+    </w:p>
+    <w:p>
+      <w:r>
+        <w:drawing>
+          <wp:inline xmlns:a="http://schemas.openxmlformats.org/drawingml/2006/main" xmlns:pic="http://schemas.openxmlformats.org/drawingml/2006/picture">
+            <wp:extent cx="1905866" cy="1270000"/>
+            <wp:docPr id="17" name="Picture 17"/>
+            <wp:cNvGraphicFramePr>
+              <a:graphicFrameLocks noChangeAspect="1"/>
+            </wp:cNvGraphicFramePr>
+            <a:graphic>
+              <a:graphicData uri="http://schemas.openxmlformats.org/drawingml/2006/picture">
+                <pic:pic>
+                  <pic:nvPicPr>
+                    <pic:cNvPr id="0" name="shelf.jpg"/>
+                    <pic:cNvPicPr/>
+                  </pic:nvPicPr>
+                  <pic:blipFill>
+                    <a:blip r:embed="rId17"/>
+                    <a:stretch>
+                      <a:fillRect/>
+                    </a:stretch>
+                  </pic:blipFill>
+                  <pic:spPr>
+                    <a:xfrm>
+                      <a:off x="0" y="0"/>
+                      <a:ext cx="1905866" cy="1270000"/>
+                    </a:xfrm>
+                    <a:prstGeom prst="rect"/>
+                  </pic:spPr>
+                </pic:pic>
+              </a:graphicData>
+            </a:graphic>
+          </wp:inline>
+        </w:drawing>
+      </w:r>
+    </w:p>
+    <w:p>
+      <w:r>
+        <w:t>A bookshelf in a London interior</w:t>
+        <w:br/>
+        <w:t>ISO Legacy | CC0</w:t>
+        <w:br/>
+        <w:t>https://isorepublic.com/photo/london-bookshelf/</w:t>
+      </w:r>
+    </w:p>
+    <w:p>
+      <w:r>
+        <w:br w:type="page"/>
+      </w:r>
+    </w:p>
+    <w:p>
+      <w:pPr>
+        <w:pStyle w:val="Heading1"/>
+      </w:pPr>
+      <w:r>
+        <w:t>Photo sources</w:t>
+      </w:r>
+    </w:p>
+    <w:p>
+      <w:r>
+        <w:t>Continued</w:t>
+      </w:r>
+    </w:p>
+    <w:p>
+      <w:r>
+        <w:drawing>
+          <wp:inline xmlns:a="http://schemas.openxmlformats.org/drawingml/2006/main" xmlns:pic="http://schemas.openxmlformats.org/drawingml/2006/picture">
+            <wp:extent cx="1905866" cy="1270000"/>
+            <wp:docPr id="18" name="Picture 18"/>
+            <wp:cNvGraphicFramePr>
+              <a:graphicFrameLocks noChangeAspect="1"/>
+            </wp:cNvGraphicFramePr>
+            <a:graphic>
+              <a:graphicData uri="http://schemas.openxmlformats.org/drawingml/2006/picture">
+                <pic:pic>
+                  <pic:nvPicPr>
+                    <pic:cNvPr id="0" name="desk.jpg"/>
+                    <pic:cNvPicPr/>
+                  </pic:nvPicPr>
+                  <pic:blipFill>
+                    <a:blip r:embed="rId14"/>
+                    <a:stretch>
+                      <a:fillRect/>
+                    </a:stretch>
+                  </pic:blipFill>
+                  <pic:spPr>
+                    <a:xfrm>
+                      <a:off x="0" y="0"/>
+                      <a:ext cx="1905866" cy="1270000"/>
+                    </a:xfrm>
+                    <a:prstGeom prst="rect"/>
+                  </pic:spPr>
+                </pic:pic>
+              </a:graphicData>
+            </a:graphic>
+          </wp:inline>
+        </w:drawing>
+      </w:r>
+    </w:p>
+    <w:p>
+      <w:r>
+        <w:t>A simple desk with a house plant and framed artwork</w:t>
+        <w:br/>
+        <w:t>Kristin Hardwick | CC0</w:t>
+        <w:br/>
+        <w:t>https://isorepublic.com/photo/house-plant-desk/</w:t>
+      </w:r>
+    </w:p>
+    <w:p>
+      <w:r>
+        <w:drawing>
+          <wp:inline xmlns:a="http://schemas.openxmlformats.org/drawingml/2006/main" xmlns:pic="http://schemas.openxmlformats.org/drawingml/2006/picture">
+            <wp:extent cx="1898097" cy="1269999"/>
+            <wp:docPr id="19" name="Picture 19"/>
+            <wp:cNvGraphicFramePr>
+              <a:graphicFrameLocks noChangeAspect="1"/>
+            </wp:cNvGraphicFramePr>
+            <a:graphic>
+              <a:graphicData uri="http://schemas.openxmlformats.org/drawingml/2006/picture">
+                <pic:pic>
+                  <pic:nvPicPr>
+                    <pic:cNvPr id="0" name="original-1.jpg"/>
+                    <pic:cNvPicPr/>
+                  </pic:nvPicPr>
+                  <pic:blipFill>
+                    <a:blip r:embed="rId11"/>
+                    <a:stretch>
+                      <a:fillRect/>
+                    </a:stretch>
+                  </pic:blipFill>
+                  <pic:spPr>
+                    <a:xfrm>
+                      <a:off x="0" y="0"/>
+                      <a:ext cx="1898097" cy="1269999"/>
+                    </a:xfrm>
+                    <a:prstGeom prst="rect"/>
+                  </pic:spPr>
+                </pic:pic>
+              </a:graphicData>
+            </a:graphic>
+          </wp:inline>
+        </w:drawing>
+      </w:r>
+    </w:p>
+    <w:p>
+      <w:r>
+        <w:t>An eclectic living room photographed by Carlos ZGZ</w:t>
+        <w:br/>
+        <w:t>Carlos ZGZ from Paris, France | CC0</w:t>
+        <w:br/>
+        <w:t>https://commons.wikimedia.org/wiki/File:Living_room_(15246771173).jpg</w:t>
+      </w:r>
+    </w:p>
+    <w:p>
+      <w:r>
+        <w:drawing>
+          <wp:inline xmlns:a="http://schemas.openxmlformats.org/drawingml/2006/main" xmlns:pic="http://schemas.openxmlformats.org/drawingml/2006/picture">
+            <wp:extent cx="1693333" cy="1270000"/>
+            <wp:docPr id="20" name="Picture 20"/>
+            <wp:cNvGraphicFramePr>
+              <a:graphicFrameLocks noChangeAspect="1"/>
+            </wp:cNvGraphicFramePr>
+            <a:graphic>
+              <a:graphicData uri="http://schemas.openxmlformats.org/drawingml/2006/picture">
+                <pic:pic>
+                  <pic:nvPicPr>
+                    <pic:cNvPr id="0" name="original-2.jpg"/>
+                    <pic:cNvPicPr/>
+                  </pic:nvPicPr>
+                  <pic:blipFill>
+                    <a:blip r:embed="rId12"/>
+                    <a:stretch>
+                      <a:fillRect/>
+                    </a:stretch>
+                  </pic:blipFill>
+                  <pic:spPr>
+                    <a:xfrm>
+                      <a:off x="0" y="0"/>
+                      <a:ext cx="1693333" cy="1270000"/>
+                    </a:xfrm>
+                    <a:prstGeom prst="rect"/>
+                  </pic:spPr>
+                </pic:pic>
+              </a:graphicData>
+            </a:graphic>
+          </wp:inline>
+        </w:drawing>
+      </w:r>
+    </w:p>
+    <w:p>
+      <w:r>
+        <w:t>A furnished living room with shelves and seating</w:t>
+        <w:br/>
+        <w:t>Lo | CC0</w:t>
+        <w:br/>
+        <w:t>https://commons.wikimedia.org/wiki/File:The_living_room_that_needs_houseplants.jpg</w:t>
+      </w:r>
+    </w:p>
+    <w:sectPr>
+      <w:pgSz w:w="12240" w:h="15840"/>
+      <w:pgMar w:top="792" w:right="936" w:bottom="792" w:left="936" w:header="720" w:footer="720" w:gutter="0"/>
+      <w:cols w:space="720"/>
+      <w:docGrid w:linePitch="360"/>
+    </w:sectPr>
   </w:body>
 </w:document>
-</file>
-
-<file path=word/footer1.xml><?xml version="1.0" encoding="utf-8"?>
-<w:ftr xmlns:m="http://schemas.openxmlformats.org/officeDocument/2006/math" xmlns:mc="http://schemas.openxmlformats.org/markup-compatibility/2006" xmlns:mo="http://schemas.microsoft.com/office/mac/office/2008/main" xmlns:mv="urn:schemas-microsoft-com:mac:vml" xmlns:o="urn:schemas-microsoft-com:office:office" xmlns:r="http://schemas.openxmlformats.org/officeDocument/2006/relationships" xmlns:v="urn:schemas-microsoft-com:vml" xmlns:w10="urn:schemas-microsoft-com:office:word" xmlns:w14="http://schemas.microsoft.com/office/word/2010/wordml" xmlns:w="http://schemas.openxmlformats.org/wordprocessingml/2006/main" xmlns:wne="http://schemas.microsoft.com/office/word/2006/wordml" xmlns:wp14="http://schemas.microsoft.com/office/word/2010/wordprocessingDrawing" xmlns:wp="http://schemas.openxmlformats.org/drawingml/2006/wordprocessingDrawing" xmlns:wpc="http://schemas.microsoft.com/office/word/2010/wordprocessingCanvas" xmlns:wpg="http://schemas.microsoft.com/office/word/2010/wordprocessingGroup" xmlns:wpi="http://schemas.microsoft.com/office/word/2010/wordprocessingInk" xmlns:wps="http://schemas.microsoft.com/office/word/2010/wordprocessingShape" mc:Ignorable="w14 wp14">
-  <w:p>
-    <w:pPr>
-      <w:pStyle w:val="Footer"/>
-    </w:pPr>
-    <w:r>
-      <w:rPr>
-        <w:sz w:val="16"/>
-      </w:rPr>
-      <w:t xml:space="preserve">Template version 1.0   |   Keep field labels unchanged   |   </w:t>
-    </w:r>
-    <w:fldSimple w:instr="PAGE"/>
-  </w:p>
-</w:ftr>
-</file>
-
-<file path=word/header1.xml><?xml version="1.0" encoding="utf-8"?>
-<w:hdr xmlns:m="http://schemas.openxmlformats.org/officeDocument/2006/math" xmlns:mc="http://schemas.openxmlformats.org/markup-compatibility/2006" xmlns:mo="http://schemas.microsoft.com/office/mac/office/2008/main" xmlns:mv="urn:schemas-microsoft-com:mac:vml" xmlns:o="urn:schemas-microsoft-com:office:office" xmlns:r="http://schemas.openxmlformats.org/officeDocument/2006/relationships" xmlns:v="urn:schemas-microsoft-com:vml" xmlns:w10="urn:schemas-microsoft-com:office:word" xmlns:w14="http://schemas.microsoft.com/office/word/2010/wordml" xmlns:w="http://schemas.openxmlformats.org/wordprocessingml/2006/main" xmlns:wne="http://schemas.microsoft.com/office/word/2006/wordml" xmlns:wp14="http://schemas.microsoft.com/office/word/2010/wordprocessingDrawing" xmlns:wp="http://schemas.openxmlformats.org/drawingml/2006/wordprocessingDrawing" xmlns:wpc="http://schemas.microsoft.com/office/word/2010/wordprocessingCanvas" xmlns:wpg="http://schemas.microsoft.com/office/word/2010/wordprocessingGroup" xmlns:wpi="http://schemas.microsoft.com/office/word/2010/wordprocessingInk" xmlns:wps="http://schemas.microsoft.com/office/word/2010/wordprocessingShape" mc:Ignorable="w14 wp14">
-  <w:p>
-    <w:pPr>
-      <w:pStyle w:val="Header"/>
-    </w:pPr>
-    <w:r>
-      <w:rPr>
-        <w:sz w:val="16"/>
-      </w:rPr>
-      <w:t>RAMA STUDIO   /   WEBSITE CONTENT TEMPLATE</w:t>
-    </w:r>
-  </w:p>
-</w:hdr>
 </file>
 
 <file path=word/numbering.xml><?xml version="1.0" encoding="utf-8"?>
@@ -2038,12 +4549,12 @@
     <w:qFormat/>
     <w:rsid w:val="00FC693F"/>
     <w:pPr>
-      <w:spacing w:after="100"/>
+      <w:spacing w:after="80"/>
     </w:pPr>
     <w:rPr>
       <w:rFonts w:ascii="Arial" w:hAnsi="Arial"/>
-      <w:color w:val="000000"/>
-      <w:sz w:val="20"/>
+      <w:color w:val="243B32"/>
+      <w:sz w:val="18"/>
     </w:rPr>
   </w:style>
   <w:style w:type="paragraph" w:styleId="Header">
@@ -2108,8 +4619,8 @@
       <w:rFonts w:asciiTheme="majorHAnsi" w:eastAsiaTheme="majorEastAsia" w:hAnsiTheme="majorHAnsi" w:cstheme="majorBidi" w:ascii="Arial" w:hAnsi="Arial"/>
       <w:b/>
       <w:bCs/>
-      <w:color w:val="000000"/>
-      <w:sz w:val="42"/>
+      <w:color w:val="243B32"/>
+      <w:sz w:val="40"/>
       <w:szCs w:val="28"/>
     </w:rPr>
   </w:style>
@@ -2132,7 +4643,7 @@
       <w:rFonts w:asciiTheme="majorHAnsi" w:eastAsiaTheme="majorEastAsia" w:hAnsiTheme="majorHAnsi" w:cstheme="majorBidi" w:ascii="Arial" w:hAnsi="Arial"/>
       <w:b/>
       <w:bCs/>
-      <w:color w:val="000000"/>
+      <w:color w:val="243B32"/>
       <w:sz w:val="26"/>
       <w:szCs w:val="26"/>
     </w:rPr>
@@ -2392,10 +4903,10 @@
     </w:pPr>
     <w:rPr>
       <w:rFonts w:asciiTheme="majorHAnsi" w:eastAsiaTheme="majorEastAsia" w:hAnsiTheme="majorHAnsi" w:cstheme="majorBidi" w:ascii="Arial" w:hAnsi="Arial"/>
-      <w:color w:val="000000"/>
+      <w:color w:val="243B32"/>
       <w:spacing w:val="5"/>
       <w:kern w:val="28"/>
-      <w:sz w:val="48"/>
+      <w:sz w:val="56"/>
       <w:szCs w:val="52"/>
     </w:rPr>
   </w:style>

</xml_diff>